<commit_message>
Add marked up copy
</commit_message>
<xml_diff>
--- a/protocol-publication/advance-trauma-protocol-paper-revision-1.docx
+++ b/protocol-publication/advance-trauma-protocol-paper-revision-1.docx
@@ -33,22 +33,7 @@
     </w:p>
     <w:p>
       <w:r>
-        <w:t xml:space="preserve">The George Institute </w:t>
-      </w:r>
-      <w:r>
-        <w:t>for</w:t>
-      </w:r>
-      <w:r>
-        <w:t xml:space="preserve"> Global Health, </w:t>
-      </w:r>
-      <w:r>
-        <w:t>New Delhi</w:t>
-      </w:r>
-      <w:r>
-        <w:t xml:space="preserve">, </w:t>
-      </w:r>
-      <w:r>
-        <w:t>India</w:t>
+        <w:t>The George Institute for Global Health, New Delhi, India</w:t>
       </w:r>
     </w:p>
     <w:p>
@@ -86,10 +71,7 @@
         </w:rPr>
       </w:pPr>
       <w:r>
-        <w:t>Department of Global Public Health</w:t>
-      </w:r>
-      <w:r>
-        <w:t xml:space="preserve">, </w:t>
+        <w:t xml:space="preserve">Department of Global Public Health, </w:t>
       </w:r>
       <w:r>
         <w:rPr>
@@ -123,13 +105,7 @@
         <w:rPr>
           <w:lang w:val="en-GB"/>
         </w:rPr>
-        <w:t>Prashant Kharat</w:t>
-      </w:r>
-      <w:r>
-        <w:rPr>
-          <w:lang w:val="en-GB"/>
-        </w:rPr>
-        <w:t xml:space="preserve"> (PK)</w:t>
+        <w:t>Prashant Kharat (PK)</w:t>
       </w:r>
     </w:p>
     <w:p>
@@ -139,22 +115,7 @@
         </w:rPr>
       </w:pPr>
       <w:r>
-        <w:t xml:space="preserve">The George Institute </w:t>
-      </w:r>
-      <w:r>
-        <w:t>for</w:t>
-      </w:r>
-      <w:r>
-        <w:t xml:space="preserve"> Global Health, </w:t>
-      </w:r>
-      <w:r>
-        <w:t>New Delhi</w:t>
-      </w:r>
-      <w:r>
-        <w:t xml:space="preserve">, </w:t>
-      </w:r>
-      <w:r>
-        <w:t>India</w:t>
+        <w:t>The George Institute for Global Health, New Delhi, India</w:t>
       </w:r>
     </w:p>
     <w:p>
@@ -434,13 +395,7 @@
         <w:rPr>
           <w:lang w:val="en-GB"/>
         </w:rPr>
-        <w:t>Martin Gerdin Wärnberg</w:t>
-      </w:r>
-      <w:r>
-        <w:rPr>
-          <w:lang w:val="en-GB"/>
-        </w:rPr>
-        <w:t xml:space="preserve"> (MGW)</w:t>
+        <w:t>Martin Gerdin Wärnberg (MGW)</w:t>
       </w:r>
     </w:p>
     <w:p>
@@ -452,10 +407,7 @@
         </w:numPr>
       </w:pPr>
       <w:r>
-        <w:t>Department of Global Public Health</w:t>
-      </w:r>
-      <w:r>
-        <w:t>, Karolinska Institutet, Stockholm, Sweden</w:t>
+        <w:t>Department of Global Public Health, Karolinska Institutet, Stockholm, Sweden</w:t>
       </w:r>
     </w:p>
     <w:p>
@@ -518,10 +470,7 @@
         <w:t xml:space="preserve">: </w:t>
       </w:r>
       <w:r>
-        <w:t xml:space="preserve">Advanced Trauma Life Support® (ATLS®) is the most widely adopted trauma life support training worldwide, but there is no high-quality evidence that it improves patient outcomes. </w:t>
-      </w:r>
-      <w:r>
-        <w:t>This trial aims to compare the effects of ATLS® training with standard care on outcomes in adult trauma patients.</w:t>
+        <w:t>Advanced Trauma Life Support® (ATLS®) is the most widely adopted trauma life support training worldwide, but there is no high-quality evidence that it improves patient outcomes. This trial aims to compare the effects of ATLS® training with standard care on outcomes in adult trauma patients.</w:t>
       </w:r>
     </w:p>
     <w:p>
@@ -536,169 +485,82 @@
         <w:t xml:space="preserve">: </w:t>
       </w:r>
       <w:r>
-        <w:rPr>
-          <w:highlight w:val="yellow"/>
-        </w:rPr>
         <w:t>ADVANCE TRAUMA is a batched stepped-wedge cluster randomised controlled trial in India, where ATLS® is not routinely</w:t>
       </w:r>
       <w:r>
-        <w:rPr>
-          <w:highlight w:val="yellow"/>
-        </w:rPr>
         <w:t xml:space="preserve"> implemented.</w:t>
       </w:r>
       <w:r>
-        <w:rPr>
-          <w:highlight w:val="yellow"/>
-        </w:rPr>
         <w:t xml:space="preserve"> The trial will be conducted in 30 clusters </w:t>
       </w:r>
       <w:r>
-        <w:rPr>
-          <w:highlight w:val="yellow"/>
-        </w:rPr>
         <w:t>(hospitals), organised into six batches of five cluster</w:t>
       </w:r>
       <w:r>
-        <w:rPr>
-          <w:highlight w:val="yellow"/>
-        </w:rPr>
         <w:t>s</w:t>
       </w:r>
       <w:r>
-        <w:rPr>
-          <w:highlight w:val="yellow"/>
-        </w:rPr>
         <w:t xml:space="preserve"> each. All clusters transition through three phases: first, a standard care phase; second, a one-month transition phase, during which the training is delivered; and finally, an intervention phase, for a total of 13 months.</w:t>
       </w:r>
       <w:r>
-        <w:rPr>
-          <w:highlight w:val="yellow"/>
-        </w:rPr>
         <w:t xml:space="preserve"> Each cluster </w:t>
       </w:r>
       <w:r>
-        <w:rPr>
-          <w:highlight w:val="yellow"/>
-        </w:rPr>
         <w:t>is</w:t>
       </w:r>
       <w:r>
-        <w:rPr>
-          <w:highlight w:val="yellow"/>
-        </w:rPr>
         <w:t xml:space="preserve"> randomised to an</w:t>
       </w:r>
       <w:r>
-        <w:rPr>
-          <w:highlight w:val="yellow"/>
-        </w:rPr>
         <w:t xml:space="preserve"> </w:t>
       </w:r>
       <w:r>
-        <w:rPr>
-          <w:highlight w:val="yellow"/>
-        </w:rPr>
         <w:t>implementation sequence that define</w:t>
       </w:r>
       <w:r>
-        <w:rPr>
-          <w:highlight w:val="yellow"/>
-        </w:rPr>
         <w:t>s</w:t>
       </w:r>
       <w:r>
-        <w:rPr>
-          <w:highlight w:val="yellow"/>
-        </w:rPr>
         <w:t xml:space="preserve"> the duration of standard care and intervention phases. </w:t>
       </w:r>
       <w:r>
-        <w:rPr>
-          <w:highlight w:val="yellow"/>
-        </w:rPr>
         <w:t xml:space="preserve">The trial will </w:t>
       </w:r>
       <w:r>
-        <w:rPr>
-          <w:highlight w:val="yellow"/>
-        </w:rPr>
         <w:t>include</w:t>
       </w:r>
       <w:r>
-        <w:rPr>
-          <w:highlight w:val="yellow"/>
-        </w:rPr>
         <w:t xml:space="preserve"> </w:t>
       </w:r>
       <w:r>
-        <w:rPr>
-          <w:highlight w:val="yellow"/>
-        </w:rPr>
         <w:t xml:space="preserve">at least </w:t>
       </w:r>
       <w:r>
-        <w:rPr>
-          <w:highlight w:val="yellow"/>
-        </w:rPr>
         <w:t xml:space="preserve">4,320 adult trauma patients (≥15 years) </w:t>
       </w:r>
       <w:r>
-        <w:rPr>
-          <w:highlight w:val="yellow"/>
-        </w:rPr>
         <w:t>who present</w:t>
       </w:r>
       <w:r>
-        <w:rPr>
-          <w:highlight w:val="yellow"/>
-        </w:rPr>
         <w:t xml:space="preserve"> to emergency departments and </w:t>
       </w:r>
       <w:r>
-        <w:rPr>
-          <w:highlight w:val="yellow"/>
-        </w:rPr>
         <w:t xml:space="preserve">are </w:t>
       </w:r>
       <w:r>
-        <w:rPr>
-          <w:highlight w:val="yellow"/>
-        </w:rPr>
-        <w:t xml:space="preserve">subsequently admitted or transferred for </w:t>
-      </w:r>
-      <w:r>
-        <w:rPr>
-          <w:highlight w:val="yellow"/>
-        </w:rPr>
-        <w:t>admission.</w:t>
-      </w:r>
-      <w:r>
-        <w:rPr>
-          <w:highlight w:val="yellow"/>
-        </w:rPr>
+        <w:t>subsequently admitted or transferred for admission.</w:t>
+      </w:r>
+      <w:r>
         <w:t xml:space="preserve"> </w:t>
       </w:r>
       <w:r>
-        <w:rPr>
-          <w:highlight w:val="yellow"/>
-        </w:rPr>
         <w:t xml:space="preserve">The primary outcome </w:t>
       </w:r>
       <w:r>
-        <w:rPr>
-          <w:highlight w:val="yellow"/>
-        </w:rPr>
         <w:t>is</w:t>
       </w:r>
       <w:r>
-        <w:rPr>
-          <w:highlight w:val="yellow"/>
-        </w:rPr>
-        <w:t xml:space="preserve"> in-hospital mortality within 30 days of arrival at the emergency department.</w:t>
-      </w:r>
-      <w:r>
-        <w:t xml:space="preserve"> </w:t>
+        <w:t xml:space="preserve"> in-hospital mortality within 30 days of arrival at the emergency department. </w:t>
       </w:r>
       <w:r>
         <w:t xml:space="preserve"> </w:t>
@@ -734,10 +596,7 @@
         <w:t>Clinical Trials Registry – India (CTRI/2024/07/071336), ClinicalTrials.gov (NCT06321419</w:t>
       </w:r>
       <w:r>
-        <w:t xml:space="preserve">, first registered </w:t>
-      </w:r>
-      <w:r>
-        <w:t>2024-03-20</w:t>
+        <w:t>, first registered 2024-03-20</w:t>
       </w:r>
       <w:r>
         <w:t>)</w:t>
@@ -929,10 +788,7 @@
               <w:t>), ClinicalTrials.gov (NCT06321419</w:t>
             </w:r>
             <w:r>
-              <w:t xml:space="preserve">, </w:t>
-            </w:r>
-            <w:r>
-              <w:t>2024-03-20</w:t>
+              <w:t>, 2024-03-20</w:t>
             </w:r>
             <w:r>
               <w:t>)</w:t>
@@ -1087,22 +943,7 @@
           </w:p>
           <w:p>
             <w:r>
-              <w:t xml:space="preserve">The George Institute </w:t>
-            </w:r>
-            <w:r>
-              <w:t>for</w:t>
-            </w:r>
-            <w:r>
-              <w:t xml:space="preserve"> Global Health, </w:t>
-            </w:r>
-            <w:r>
-              <w:t>New Delhi</w:t>
-            </w:r>
-            <w:r>
-              <w:t xml:space="preserve">, </w:t>
-            </w:r>
-            <w:r>
-              <w:t>India</w:t>
+              <w:t>The George Institute for Global Health, New Delhi, India</w:t>
             </w:r>
           </w:p>
           <w:p>
@@ -1140,10 +981,7 @@
               </w:rPr>
             </w:pPr>
             <w:r>
-              <w:t>Department of Global Public Health</w:t>
-            </w:r>
-            <w:r>
-              <w:t xml:space="preserve">, </w:t>
+              <w:t xml:space="preserve">Department of Global Public Health, </w:t>
             </w:r>
             <w:r>
               <w:rPr>
@@ -1177,13 +1015,7 @@
               <w:rPr>
                 <w:lang w:val="en-GB"/>
               </w:rPr>
-              <w:t>Prashant Kharat</w:t>
-            </w:r>
-            <w:r>
-              <w:rPr>
-                <w:lang w:val="en-GB"/>
-              </w:rPr>
-              <w:t xml:space="preserve"> (PK)</w:t>
+              <w:t>Prashant Kharat (PK)</w:t>
             </w:r>
           </w:p>
           <w:p>
@@ -1193,22 +1025,7 @@
               </w:rPr>
             </w:pPr>
             <w:r>
-              <w:t xml:space="preserve">The George Institute </w:t>
-            </w:r>
-            <w:r>
-              <w:t>for</w:t>
-            </w:r>
-            <w:r>
-              <w:t xml:space="preserve"> Global Health, </w:t>
-            </w:r>
-            <w:r>
-              <w:t>New Delhi</w:t>
-            </w:r>
-            <w:r>
-              <w:t xml:space="preserve">, </w:t>
-            </w:r>
-            <w:r>
-              <w:t>India</w:t>
+              <w:t>The George Institute for Global Health, New Delhi, India</w:t>
             </w:r>
           </w:p>
           <w:p>
@@ -1489,13 +1306,7 @@
               <w:rPr>
                 <w:lang w:val="en-GB"/>
               </w:rPr>
-              <w:t>Martin Gerdin Wärnberg</w:t>
-            </w:r>
-            <w:r>
-              <w:rPr>
-                <w:lang w:val="en-GB"/>
-              </w:rPr>
-              <w:t xml:space="preserve"> (MGW)</w:t>
+              <w:t>Martin Gerdin Wärnberg (MGW)</w:t>
             </w:r>
           </w:p>
           <w:p>
@@ -1507,10 +1318,7 @@
               </w:numPr>
             </w:pPr>
             <w:r>
-              <w:t>Department of Global Public Health</w:t>
-            </w:r>
-            <w:r>
-              <w:t>, Karolinska Institutet, Stockholm, Sweden</w:t>
+              <w:t>Department of Global Public Health, Karolinska Institutet, Stockholm, Sweden</w:t>
             </w:r>
           </w:p>
           <w:p>
@@ -1994,7 +1802,13 @@
         <w:t>7</w:t>
       </w:r>
       <w:r>
-        <w:t>) observational studies on the effect of ATLS on mortality</w:t>
+        <w:t xml:space="preserve">) observational studies on the effect of </w:t>
+      </w:r>
+      <w:r>
+        <w:t>ATLS®</w:t>
+      </w:r>
+      <w:r>
+        <w:t>on mortality</w:t>
       </w:r>
       <w:r>
         <w:t xml:space="preserve"> </w:t>
@@ -2106,13 +1920,7 @@
     </w:p>
     <w:p>
       <w:r>
-        <w:t>This is a batched stepped-wedge cluster randomised controlled trial in India</w:t>
-      </w:r>
-      <w:r>
-        <w:t xml:space="preserve"> (see Figure 1).</w:t>
-      </w:r>
-      <w:r>
-        <w:t xml:space="preserve"> The stepped-wedge trial is a unidirectional crossover trial, with a randomised time point when clusters cross-over from standard care to the intervention </w:t>
+        <w:t xml:space="preserve">This is a batched stepped-wedge cluster randomised controlled trial in India (see Figure 1). The stepped-wedge trial is a unidirectional crossover trial, with a randomised time point when clusters cross-over from standard care to the intervention </w:t>
       </w:r>
       <w:r>
         <w:fldChar w:fldCharType="begin"/>
@@ -2150,25 +1958,13 @@
         <w:t>Because certain secondary outcomes will be more burdensome to collect and because we anticipate larger effects on these outcomes, w</w:t>
       </w:r>
       <w:r>
-        <w:t xml:space="preserve">e will nest a staircase design within </w:t>
-      </w:r>
-      <w:r>
-        <w:t xml:space="preserve">the main stepped-wedge design to measure </w:t>
+        <w:t xml:space="preserve">e will nest a staircase design within the main stepped-wedge design to measure </w:t>
       </w:r>
       <w:r>
         <w:t>these</w:t>
       </w:r>
       <w:r>
-        <w:t xml:space="preserve"> outcomes (see </w:t>
-      </w:r>
-      <w:r>
-        <w:t>Figure 2</w:t>
-      </w:r>
-      <w:r>
-        <w:t>)</w:t>
-      </w:r>
-      <w:r>
-        <w:t xml:space="preserve"> </w:t>
+        <w:t xml:space="preserve"> outcomes (see Figure 2) </w:t>
       </w:r>
       <w:r>
         <w:fldChar w:fldCharType="begin"/>
@@ -2189,13 +1985,7 @@
         <w:fldChar w:fldCharType="end"/>
       </w:r>
       <w:r>
-        <w:t xml:space="preserve">. The staircase design will include a random subset of patients </w:t>
-      </w:r>
-      <w:r>
-        <w:t>who present</w:t>
-      </w:r>
-      <w:r>
-        <w:t xml:space="preserve"> during the three months preceding and the three months following the transition phase.</w:t>
+        <w:t>. The staircase design will include a random subset of patients who present during the three months preceding and the three months following the transition phase.</w:t>
       </w:r>
     </w:p>
     <w:p>
@@ -2824,7 +2614,7 @@
         <w:t>ﬀ</w:t>
       </w:r>
       <w:r>
-        <w:t>icers, surgical residents, or emergency medicine residents, depending on the setup at each participating centre. Physicians will be trained in an accredited ATLS® training facility in India. The training will occur during the transition phase in each cluster. Our experience from the pilot study is that study sites adhere to the training slot allotted to them through the trial; therefore, we judge the risk of clusters implementing ATLS ® before their randomised implementation sequence to be very low.</w:t>
+        <w:t>icers, surgical residents, or emergency medicine residents, depending on the setup at each participating centre. Physicians will be trained in an accredited ATLS® training facility in India. The training will occur during the transition phase in each cluster. Our experience from the pilot study is that study sites adhere to the training slot allotted to them through the trial; therefore, we judge the risk of clusters implementing ATLS® before their randomised implementation sequence to be very low.</w:t>
       </w:r>
       <w:r>
         <w:rPr>
@@ -2845,7 +2635,19 @@
         <w:t>ﬀ</w:t>
       </w:r>
       <w:r>
-        <w:t>ing of their emergency departments in units, and physicians in the same unit work together in the emergency department on the same days of the week. These physicians’ duties may change into another department as per the residency programme. Therefore, we will collect data only on the days when these units work. The units selected from each hospital will be a convenience sample of all eligible units in those hospitals. We will also assess adherence to ATLS principles before and after implementing ATLS training.</w:t>
+        <w:t xml:space="preserve">ing of their emergency departments in units, and physicians in the same unit work together in the emergency department on the same days of the week. These physicians’ duties may change into another department as per the residency programme. Therefore, we will collect data only on the days when these units work. The units selected from each hospital will be a convenience sample of all eligible units in those hospitals. We will also assess adherence to </w:t>
+      </w:r>
+      <w:r>
+        <w:t xml:space="preserve">ATLS® </w:t>
+      </w:r>
+      <w:r>
+        <w:t xml:space="preserve">principles before and after implementing </w:t>
+      </w:r>
+      <w:r>
+        <w:t xml:space="preserve">ATLS® </w:t>
+      </w:r>
+      <w:r>
+        <w:t>training.</w:t>
       </w:r>
     </w:p>
     <w:p>
@@ -2932,13 +2734,7 @@
     <w:p>
       <w:r>
         <w:lastRenderedPageBreak/>
-        <w:t xml:space="preserve">Other than </w:t>
-      </w:r>
-      <w:r>
-        <w:t>the implementation of</w:t>
-      </w:r>
-      <w:r>
-        <w:t xml:space="preserve"> another formalised trauma life support training programme or other major interventions to change the care of trauma patients as specified in the exclusion criteria, concomitant use of other medications and treatments may be provided at the discretion of the investigators and will not be considered an exclusion criterion.</w:t>
+        <w:t>Other than the implementation of another formalised trauma life support training programme or other major interventions to change the care of trauma patients as specified in the exclusion criteria, concomitant use of other medications and treatments may be provided at the discretion of the investigators and will not be considered an exclusion criterion.</w:t>
       </w:r>
     </w:p>
     <w:p>
@@ -2976,24 +2772,9 @@
         <w:t>)</w:t>
       </w:r>
       <w:r>
-        <w:t xml:space="preserve">. </w:t>
-      </w:r>
-      <w:r>
-        <w:rPr>
-          <w:highlight w:val="yellow"/>
-        </w:rPr>
-        <w:t>Outcomes that cannot be confirmed at the designated time point will be considered missing</w:t>
-      </w:r>
-      <w:r>
-        <w:rPr>
-          <w:highlight w:val="yellow"/>
-        </w:rPr>
-        <w:t>.</w:t>
-      </w:r>
-      <w:r>
-        <w:rPr>
-          <w:highlight w:val="yellow"/>
-        </w:rPr>
+        <w:t>. Outcomes that cannot be confirmed at the designated time point will be considered missing.</w:t>
+      </w:r>
+      <w:r>
         <w:t xml:space="preserve"> </w:t>
       </w:r>
     </w:p>
@@ -3642,46 +3423,7 @@
     </w:p>
     <w:p>
       <w:r>
-        <w:t>The patient p</w:t>
-      </w:r>
-      <w:r>
-        <w:t xml:space="preserve">articipants </w:t>
-      </w:r>
-      <w:r>
-        <w:t>will be</w:t>
-      </w:r>
-      <w:r>
-        <w:t xml:space="preserve"> adult trauma patients who present to the emergency department</w:t>
-      </w:r>
-      <w:r>
-        <w:t>s</w:t>
-      </w:r>
-      <w:r>
-        <w:t xml:space="preserve"> of </w:t>
-      </w:r>
-      <w:r>
-        <w:t xml:space="preserve">the </w:t>
-      </w:r>
-      <w:r>
-        <w:t>participating hospitals and are admitted or transferred for admission.</w:t>
-      </w:r>
-      <w:r>
-        <w:t xml:space="preserve"> Participants are screened by the clinical research coordinators and a</w:t>
-      </w:r>
-      <w:r>
-        <w:t xml:space="preserve">ll participants who meet the eligibility criteria will be included in the study. </w:t>
-      </w:r>
-      <w:r>
-        <w:t>The p</w:t>
-      </w:r>
-      <w:r>
-        <w:t>articipant</w:t>
-      </w:r>
-      <w:r>
-        <w:t>’s</w:t>
-      </w:r>
-      <w:r>
-        <w:t xml:space="preserve"> baseline and subsequent data will be collected as per Table 2</w:t>
+        <w:t>The patient participants will be adult trauma patients who present to the emergency departments of the participating hospitals and are admitted or transferred for admission. Participants are screened by the clinical research coordinators and all participants who meet the eligibility criteria will be included in the study. The participant’s baseline and subsequent data will be collected as per Table 2</w:t>
       </w:r>
       <w:r>
         <w:t xml:space="preserve"> and 3</w:t>
@@ -4805,13 +4547,7 @@
         <w:t>1</w:t>
       </w:r>
       <w:r>
-        <w:t>Clinical research coordinators will inform patient participants about the study, including their right to withdraw their data from the study at any time, and will approach them in person or by telephone for informed consent for the collection of non</w:t>
-      </w:r>
-      <w:r>
-        <w:t>-</w:t>
-      </w:r>
-      <w:r>
-        <w:t>routinely recorded.</w:t>
+        <w:t>Clinical research coordinators will inform patient participants about the study, including their right to withdraw their data from the study at any time, and will approach them in person or by telephone for informed consent for the collection of non-routinely recorded.</w:t>
       </w:r>
     </w:p>
     <w:p>
@@ -5262,10 +4998,7 @@
     </w:tbl>
     <w:p>
       <w:r>
-        <w:t xml:space="preserve">Abbreviations: EQ-5D EuroQol 5 dimensions, WHODAS World Health Organization Disability Assessment </w:t>
-      </w:r>
-      <w:r>
-        <w:t>Schedule</w:t>
+        <w:t>Abbreviations: EQ-5D EuroQol 5 dimensions, WHODAS World Health Organization Disability Assessment Schedule</w:t>
       </w:r>
     </w:p>
     <w:p>
@@ -5442,13 +5175,7 @@
     <w:p>
       <w:r>
         <w:lastRenderedPageBreak/>
-        <w:t xml:space="preserve">The secondary outcomes that will be measured using the nested staircase design are adherence to ATLS® principles during initial patient resuscitation, quality of life, and disability. </w:t>
-      </w:r>
-      <w:r>
-        <w:t xml:space="preserve">We will not include any multiplicity adjustment as these are intended to be hypothesis driving only. </w:t>
-      </w:r>
-      <w:r>
-        <w:t xml:space="preserve">The expected effect of the intervention on each of these outcomes are an improvement in adherence from 50% during standard care to 70% after training </w:t>
+        <w:t xml:space="preserve">The secondary outcomes that will be measured using the nested staircase design are adherence to ATLS® principles during initial patient resuscitation, quality of life, and disability. We will not include any multiplicity adjustment as these are intended to be hypothesis driving only. The expected effect of the intervention on each of these outcomes are an improvement in adherence from 50% during standard care to 70% after training </w:t>
       </w:r>
       <w:r>
         <w:fldChar w:fldCharType="begin"/>
@@ -5469,13 +5196,7 @@
         <w:fldChar w:fldCharType="end"/>
       </w:r>
       <w:r>
-        <w:t>,</w:t>
-      </w:r>
-      <w:r>
-        <w:t xml:space="preserve"> an increase in EQ5D5L health status from 70 during care to 75 after training</w:t>
-      </w:r>
-      <w:r>
-        <w:t xml:space="preserve"> </w:t>
+        <w:t xml:space="preserve">, an increase in EQ5D5L health status from 70 during care to 75 after training </w:t>
       </w:r>
       <w:r>
         <w:fldChar w:fldCharType="begin"/>
@@ -5517,22 +5238,7 @@
         <w:fldChar w:fldCharType="end"/>
       </w:r>
       <w:r>
-        <w:t xml:space="preserve">. </w:t>
-      </w:r>
-      <w:r>
-        <w:t xml:space="preserve">For quality of life and disability, these effects correspond to standardised effect sizes, expressed as Cohen's d of 0.5. With </w:t>
-      </w:r>
-      <w:r>
-        <w:t xml:space="preserve">a total of </w:t>
-      </w:r>
-      <w:r>
-        <w:t xml:space="preserve">30 clusters, six per sequence, for a discrete time decay correlation structure, with ICCs of 0.01 to 0.15 and a CAC of 0.8, there is &gt;80% power to detect these effects by including four patients in each cluster in each period. </w:t>
-      </w:r>
-      <w:r>
-        <w:t>To account</w:t>
-      </w:r>
-      <w:r>
-        <w:t xml:space="preserve"> for loss to follow-up, we will include at least six patients per cluster per month</w:t>
+        <w:t>. For quality of life and disability, these effects correspond to standardised effect sizes, expressed as Cohen's d of 0.5. With a total of 30 clusters, six per sequence, for a discrete time decay correlation structure, with ICCs of 0.01 to 0.15 and a CAC of 0.8, there is &gt;80% power to detect these effects by including four patients in each cluster in each period. To account for loss to follow-up, we will include at least six patients per cluster per month</w:t>
       </w:r>
       <w:r>
         <w:t xml:space="preserve">, sampled as described </w:t>
@@ -5618,16 +5324,7 @@
         <w:t xml:space="preserve">under the nested staircase design will </w:t>
       </w:r>
       <w:r>
-        <w:t>constitute</w:t>
-      </w:r>
-      <w:r>
-        <w:t xml:space="preserve"> a random subset of patients included during the staircase months. The random subset will be selected using simple random sampling </w:t>
-      </w:r>
-      <w:r>
-        <w:t>at</w:t>
-      </w:r>
-      <w:r>
-        <w:t xml:space="preserve"> the shift level, meaning that the timing of the clinical research coordinator's shift will be randomised to cover approximately eight hours during the morning, afternoon, or night shift. </w:t>
+        <w:t xml:space="preserve">constitute a random subset of patients included during the staircase months. The random subset will be selected using simple random sampling at the shift level, meaning that the timing of the clinical research coordinator's shift will be randomised to cover approximately eight hours during the morning, afternoon, or night shift. </w:t>
       </w:r>
       <w:r>
         <w:t>ATLS®</w:t>
@@ -5642,13 +5339,7 @@
         <w:t>recorded</w:t>
       </w:r>
       <w:r>
-        <w:t xml:space="preserve"> </w:t>
-      </w:r>
-      <w:r>
-        <w:t>for</w:t>
-      </w:r>
-      <w:r>
-        <w:t xml:space="preserve"> all patients included during these shifts. </w:t>
+        <w:t xml:space="preserve"> for all patients included during these shifts. </w:t>
       </w:r>
       <w:r>
         <w:t>Q</w:t>
@@ -5710,13 +5401,7 @@
         <w:rPr>
           <w:rStyle w:val="NoneA"/>
         </w:rPr>
-        <w:t xml:space="preserve">The allocation sequence is generated by JM. Participants are included by clinical </w:t>
-      </w:r>
-      <w:r>
-        <w:rPr>
-          <w:rStyle w:val="NoneA"/>
-        </w:rPr>
-        <w:t>research coordinators at each participating site. The time point when the intervention is implemented is determined by the randomised intervention sequence, and participants included after this time point are considered exposed to the intervention.</w:t>
+        <w:t>The allocation sequence is generated by JM. Participants are included by clinical research coordinators at each participating site. The time point when the intervention is implemented is determined by the randomised intervention sequence, and participants included after this time point are considered exposed to the intervention.</w:t>
       </w:r>
     </w:p>
     <w:p>
@@ -5867,21 +5552,9 @@
         </w:rPr>
       </w:pPr>
       <w:r>
-        <w:rPr>
-          <w:highlight w:val="yellow"/>
-        </w:rPr>
-        <w:t xml:space="preserve">Outcomes will be assessed and collected as described in Table 1. Outcome recording will be verified for a sample of observations through remote and on-site monitoring of source data by the coordinating </w:t>
-      </w:r>
-      <w:r>
-        <w:rPr>
-          <w:highlight w:val="yellow"/>
-        </w:rPr>
-        <w:t>centre.</w:t>
-      </w:r>
-      <w:r>
-        <w:rPr>
-          <w:highlight w:val="yellow"/>
-        </w:rPr>
+        <w:t>Outcomes will be assessed and collected as described in Table 1. Outcome recording will be verified for a sample of observations through remote and on-site monitoring of source data by the coordinating centre.</w:t>
+      </w:r>
+      <w:r>
         <w:t xml:space="preserve"> The source data of all patients who die in-hospital are reviewed.</w:t>
       </w:r>
       <w:r>
@@ -5960,42 +5633,34 @@
         <w:t xml:space="preserve"> </w:t>
       </w:r>
       <w:r>
-        <w:rPr>
-          <w:highlight w:val="yellow"/>
-        </w:rPr>
         <w:t>For outcomes collected through telephone follow up</w:t>
       </w:r>
       <w:r>
         <w:rPr>
-          <w:highlight w:val="yellow"/>
           <w:lang w:val="en-GB"/>
         </w:rPr>
         <w:t xml:space="preserve">, at least three calls are attempted. Depending on the response, a subsequent call </w:t>
       </w:r>
       <w:r>
         <w:rPr>
-          <w:highlight w:val="yellow"/>
           <w:lang w:val="en-GB"/>
         </w:rPr>
         <w:t xml:space="preserve">to complete the follow-up may </w:t>
       </w:r>
       <w:r>
         <w:rPr>
-          <w:highlight w:val="yellow"/>
           <w:lang w:val="en-GB"/>
         </w:rPr>
         <w:t>be scheduled. In cases where no contact can be established despite repeated attempts, the participant is classified as los</w:t>
       </w:r>
       <w:r>
         <w:rPr>
-          <w:highlight w:val="yellow"/>
           <w:lang w:val="en-GB"/>
         </w:rPr>
         <w:t>t</w:t>
       </w:r>
       <w:r>
         <w:rPr>
-          <w:highlight w:val="yellow"/>
           <w:lang w:val="en-GB"/>
         </w:rPr>
         <w:t xml:space="preserve"> to follow-up.</w:t>
@@ -6039,13 +5704,7 @@
         <w:rPr>
           <w:color w:val="000000"/>
         </w:rPr>
-        <w:t>Pseudonymised</w:t>
-      </w:r>
-      <w:r>
-        <w:rPr>
-          <w:color w:val="000000"/>
-        </w:rPr>
-        <w:t xml:space="preserve"> data will be transferred to secure servers at Karolinska Institutet for analysis.</w:t>
+        <w:t>Pseudonymised data will be transferred to secure servers at Karolinska Institutet for analysis.</w:t>
       </w:r>
     </w:p>
     <w:p>
@@ -6182,24 +5841,12 @@
         <w:t>In the case of binary outcomes,</w:t>
       </w:r>
       <w:r>
-        <w:t xml:space="preserve"> </w:t>
-      </w:r>
-      <w:r>
-        <w:rPr>
-          <w:highlight w:val="yellow"/>
-        </w:rPr>
-        <w:t>the primary estimand will be the odds ratio obtained from</w:t>
-      </w:r>
-      <w:r>
-        <w:rPr>
-          <w:highlight w:val="yellow"/>
-        </w:rPr>
+        <w:t xml:space="preserve"> the primary estimand will be the odds ratio obtained from</w:t>
+      </w:r>
+      <w:r>
         <w:t xml:space="preserve"> a mixed effects binomial regression with a logit lin</w:t>
       </w:r>
       <w:r>
-        <w:rPr>
-          <w:highlight w:val="yellow"/>
-        </w:rPr>
         <w:t>k. We will also apply</w:t>
       </w:r>
       <w:r>
@@ -6295,75 +5942,15 @@
     </w:p>
     <w:p>
       <w:r>
-        <w:t>There will be one interim analysis after half of the batches have completed the trial. The interim analysis will be assessed by the joint Trial Steering and Data Monitoring Committee. The purposes of this interim analysis will be to</w:t>
-      </w:r>
-      <w:r>
-        <w:t xml:space="preserve"> </w:t>
-      </w:r>
-      <w:r>
-        <w:t xml:space="preserve">assess the trial's feasibility and recommend </w:t>
-      </w:r>
-      <w:r>
-        <w:t>that</w:t>
-      </w:r>
-      <w:r>
-        <w:t xml:space="preserve"> the trial </w:t>
-      </w:r>
-      <w:r>
-        <w:t xml:space="preserve">be stopped </w:t>
-      </w:r>
-      <w:r>
-        <w:t xml:space="preserve">if </w:t>
-      </w:r>
-      <w:r>
-        <w:t>it</w:t>
-      </w:r>
-      <w:r>
-        <w:t xml:space="preserve"> is not feasible</w:t>
-      </w:r>
-      <w:r>
-        <w:t xml:space="preserve"> (e.g. </w:t>
-      </w:r>
-      <w:r>
-        <w:t>if hospitals fail to adhere to the randomisation schedule or if there are substantial missing data in outcomes</w:t>
-      </w:r>
-      <w:r>
-        <w:t xml:space="preserve">), and to </w:t>
-      </w:r>
-      <w:r>
-        <w:t>compare characteristics across intervention conditions to monitor for differential recruitment/ascertainment between</w:t>
-      </w:r>
-      <w:r>
-        <w:t xml:space="preserve"> the</w:t>
-      </w:r>
-      <w:r>
-        <w:t xml:space="preserve"> intervention and control</w:t>
-      </w:r>
-      <w:r>
-        <w:t xml:space="preserve"> groups</w:t>
-      </w:r>
-      <w:r>
-        <w:t>.</w:t>
-      </w:r>
-      <w:r>
-        <w:t xml:space="preserve"> </w:t>
-      </w:r>
-      <w:r>
-        <w:rPr>
-          <w:highlight w:val="yellow"/>
-        </w:rPr>
-        <w:t xml:space="preserve">No efficacy stopping is planned because any estimates obtained at the time point of the interim analysis will be associated with major </w:t>
-      </w:r>
-      <w:r>
-        <w:rPr>
-          <w:highlight w:val="yellow"/>
-        </w:rPr>
+        <w:t>There will be one interim analysis after half of the batches have completed the trial. The interim analysis will be assessed by the joint Trial Steering and Data Monitoring Committee. The purposes of this interim analysis will be to assess the trial's feasibility and recommend that the trial be stopped if it is not feasible (e.g. if hospitals fail to adhere to the randomisation schedule or if there are substantial missing data in outcomes), and to compare characteristics across intervention conditions to monitor for differential recruitment/ascertainment between the intervention and control groups.</w:t>
+      </w:r>
+      <w:r>
+        <w:t xml:space="preserve"> No efficacy stopping is planned because any estimates obtained at the time point of the interim analysis will be associated with major </w:t>
+      </w:r>
+      <w:r>
         <w:t xml:space="preserve">statistical </w:t>
       </w:r>
       <w:r>
-        <w:rPr>
-          <w:highlight w:val="yellow"/>
-        </w:rPr>
         <w:t>uncertainties.</w:t>
       </w:r>
     </w:p>
@@ -6550,19 +6137,7 @@
     </w:p>
     <w:p>
       <w:r>
-        <w:t>The t</w:t>
-      </w:r>
-      <w:r>
-        <w:t xml:space="preserve">rial management and oversight </w:t>
-      </w:r>
-      <w:r>
-        <w:t>are</w:t>
-      </w:r>
-      <w:r>
-        <w:t xml:space="preserve"> governed by three trial committees and groups: the Trial Team (TT), the Trial Management Group (TMG), the joint Trial Steering and Data Monitoring Committee (SDMC).</w:t>
-      </w:r>
-      <w:r>
-        <w:t xml:space="preserve"> The TT is responsible for running the trial operations on a day-to-day basis, maintaining trial databases, randomising clusters, ensuring complete and correct data, and preparing reports for meetings (including those of the TMG, and the SDMC). The TT will also address research governance and regulatory matters wherever needed. The TMG will be responsible for managing the trial, including its clinical and practical aspects as well as technical aspects and any safety issues related to the trial participants. In addition, the TMG will be also responsible for providing inputs to the SDMC meetings.</w:t>
+        <w:t>The trial management and oversight are governed by three trial committees and groups: the Trial Team (TT), the Trial Management Group (TMG), the joint Trial Steering and Data Monitoring Committee (SDMC). The TT is responsible for running the trial operations on a day-to-day basis, maintaining trial databases, randomising clusters, ensuring complete and correct data, and preparing reports for meetings (including those of the TMG, and the SDMC). The TT will also address research governance and regulatory matters wherever needed. The TMG will be responsible for managing the trial, including its clinical and practical aspects as well as technical aspects and any safety issues related to the trial participants. In addition, the TMG will be also responsible for providing inputs to the SDMC meetings.</w:t>
       </w:r>
     </w:p>
     <w:p>
@@ -6691,16 +6266,7 @@
         </w:rPr>
       </w:pPr>
       <w:r>
-        <w:t xml:space="preserve">In line with other current trials </w:t>
-      </w:r>
-      <w:r>
-        <w:t>that include</w:t>
-      </w:r>
-      <w:r>
-        <w:t xml:space="preserve"> critically ill patients</w:t>
-      </w:r>
-      <w:r>
-        <w:t xml:space="preserve"> </w:t>
+        <w:t xml:space="preserve">In line with other current trials that include critically ill patients </w:t>
       </w:r>
       <w:r>
         <w:fldChar w:fldCharType="begin"/>
@@ -6721,40 +6287,19 @@
         <w:fldChar w:fldCharType="end"/>
       </w:r>
       <w:r>
-        <w:t>, we will not collect adverse events or serious adverse events, because many of these events are expected in this patient population</w:t>
-      </w:r>
-      <w:r>
-        <w:t xml:space="preserve">. </w:t>
+        <w:t xml:space="preserve">, we will not collect adverse events or serious adverse events, because many of these events are expected in this patient population. </w:t>
       </w:r>
       <w:r>
         <w:t>In addition, w</w:t>
       </w:r>
       <w:r>
-        <w:t xml:space="preserve">e already collect many of these events, </w:t>
-      </w:r>
-      <w:r>
-        <w:t>such as</w:t>
-      </w:r>
-      <w:r>
-        <w:t xml:space="preserve"> mortality, as part of our outcomes. </w:t>
+        <w:t xml:space="preserve">e already collect many of these events, such as mortality, as part of our outcomes. </w:t>
       </w:r>
       <w:r>
         <w:rPr>
           <w:color w:val="000000"/>
         </w:rPr>
-        <w:t xml:space="preserve">We will only report safety events if they are life-threatening, prolong hospitalisation or result in meaningful harm to the participant. It is difficult to predefine a comprehensive list of events that can be considered safety events, but </w:t>
-      </w:r>
-      <w:r>
-        <w:rPr>
-          <w:color w:val="000000"/>
-        </w:rPr>
-        <w:t xml:space="preserve">we </w:t>
-      </w:r>
-      <w:r>
-        <w:rPr>
-          <w:color w:val="000000"/>
-        </w:rPr>
-        <w:t>will actively assess the presence of the following safety events:</w:t>
+        <w:t>We will only report safety events if they are life-threatening, prolong hospitalisation or result in meaningful harm to the participant. It is difficult to predefine a comprehensive list of events that can be considered safety events, but we will actively assess the presence of the following safety events:</w:t>
       </w:r>
     </w:p>
     <w:p>
@@ -6795,22 +6340,7 @@
     </w:p>
     <w:p>
       <w:r>
-        <w:t xml:space="preserve">These are considered safety events because they </w:t>
-      </w:r>
-      <w:r>
-        <w:t xml:space="preserve">may </w:t>
-      </w:r>
-      <w:r>
-        <w:t xml:space="preserve">suggest pulmonary, renal, septic or bleeding complications, and an increase in their occurrence following ATLS® training may indicate that the intervention is harmful. These events must therefore be tracked during the standard care phase as well as the intervention phase. However, these events will be considered indicative of harm related to the intervention only if they occurr more often during the intervention phase than during the standard care phase. In addition, safety reports other than those mentioned above will be collected. These events will </w:t>
-      </w:r>
-      <w:r>
-        <w:t>be identified</w:t>
-      </w:r>
-      <w:r>
-        <w:t xml:space="preserve"> during the</w:t>
-      </w:r>
-      <w:r>
-        <w:t xml:space="preserve"> trial, and the reporting of these safety events will be based on the clinical judgement of the site investigators. Examples of safety events may include missed injuries or missed investigations, which may be suspected if certain injuries or investigations were identified or conducted more often during the standard care phase than during the intervention phase.</w:t>
+        <w:t>These are considered safety events because they may suggest pulmonary, renal, septic or bleeding complications, and an increase in their occurrence following ATLS® training may indicate that the intervention is harmful. These events must therefore be tracked during the standard care phase as well as the intervention phase. However, these events will be considered indicative of harm related to the intervention only if they occurr more often during the intervention phase than during the standard care phase. In addition, safety reports other than those mentioned above will be collected. These events will be identified during the trial, and the reporting of these safety events will be based on the clinical judgement of the site investigators. Examples of safety events may include missed injuries or missed investigations, which may be suspected if certain injuries or investigations were identified or conducted more often during the standard care phase than during the intervention phase.</w:t>
       </w:r>
     </w:p>
     <w:p>
@@ -6949,31 +6479,7 @@
     </w:p>
     <w:p>
       <w:r>
-        <w:t xml:space="preserve">In addition to being accountable for the parts of the work </w:t>
-      </w:r>
-      <w:r>
-        <w:t>completed</w:t>
-      </w:r>
-      <w:r>
-        <w:t>, an author should be able to identify which coauthors are responsible for other</w:t>
-      </w:r>
-      <w:r>
-        <w:t xml:space="preserve"> </w:t>
-      </w:r>
-      <w:r>
-        <w:t xml:space="preserve">specific parts of the work. In addition, authors should have confidence in the integrity of the contributions of their coauthors. The most recent version of the ICMJE criteria will be </w:t>
-      </w:r>
-      <w:r>
-        <w:t>followed</w:t>
-      </w:r>
-      <w:r>
-        <w:t xml:space="preserve">. We will also use the ICMJE criteria for nonauthor contributorship. Before work on a trial manuscript is initiated, a writing group will be formed and first and last authors will be designated. This writing group will be formed by discussion in the </w:t>
-      </w:r>
-      <w:r>
-        <w:t>TMG</w:t>
-      </w:r>
-      <w:r>
-        <w:t>.</w:t>
+        <w:t>In addition to being accountable for the parts of the work completed, an author should be able to identify which coauthors are responsible for other specific parts of the work. In addition, authors should have confidence in the integrity of the contributions of their coauthors. The most recent version of the ICMJE criteria will be followed. We will also use the ICMJE criteria for nonauthor contributorship. Before work on a trial manuscript is initiated, a writing group will be formed and first and last authors will be designated. This writing group will be formed by discussion in the TMG.</w:t>
       </w:r>
     </w:p>
     <w:p>
@@ -7177,19 +6683,7 @@
         <w:rPr>
           <w:rStyle w:val="None"/>
         </w:rPr>
-        <w:t xml:space="preserve">We would like to acknowledge </w:t>
-      </w:r>
-      <w:r>
-        <w:rPr>
-          <w:rStyle w:val="None"/>
-        </w:rPr>
-        <w:t xml:space="preserve">the efforts of </w:t>
-      </w:r>
-      <w:r>
-        <w:rPr>
-          <w:rStyle w:val="None"/>
-        </w:rPr>
-        <w:t>all current and future site investigators, clinical research coordinators, and staff at the coordinating centre who help run this trial.</w:t>
+        <w:t>We would like to acknowledge the efforts of all current and future site investigators, clinical research coordinators, and staff at the coordinating centre who help run this trial.</w:t>
       </w:r>
     </w:p>
     <w:p>
@@ -7303,13 +6797,7 @@
         <w:t>es</w:t>
       </w:r>
       <w:r>
-        <w:t>, and the Swedish Ethical Review Authority (</w:t>
-      </w:r>
-      <w:r>
-        <w:t>2024-07547-01</w:t>
-      </w:r>
-      <w:r>
-        <w:t xml:space="preserve">) </w:t>
+        <w:t xml:space="preserve">, and the Swedish Ethical Review Authority (2024-07547-01) </w:t>
       </w:r>
     </w:p>
     <w:p>

</xml_diff>

<commit_message>
Update revised protocol paper after comments
</commit_message>
<xml_diff>
--- a/protocol-publication/advance-trauma-protocol-paper-revision-1.docx
+++ b/protocol-publication/advance-trauma-protocol-paper-revision-1.docx
@@ -551,19 +551,7 @@
         <w:t>subsequently admitted or transferred for admission.</w:t>
       </w:r>
       <w:r>
-        <w:t xml:space="preserve"> </w:t>
-      </w:r>
-      <w:r>
-        <w:t xml:space="preserve">The primary outcome </w:t>
-      </w:r>
-      <w:r>
-        <w:t>is</w:t>
-      </w:r>
-      <w:r>
-        <w:t xml:space="preserve"> in-hospital mortality within 30 days of arrival at the emergency department. </w:t>
-      </w:r>
-      <w:r>
-        <w:t xml:space="preserve"> </w:t>
+        <w:t xml:space="preserve"> The primary outcome is in-hospital mortality within 30 days of arrival at the emergency department.  </w:t>
       </w:r>
     </w:p>
     <w:p>
@@ -1980,7 +1968,7 @@
           <w:noProof/>
         </w:rPr>
         <w:drawing>
-          <wp:inline distT="0" distB="0" distL="0" distR="0" wp14:anchorId="4B665B8A" wp14:editId="07D3E02B">
+          <wp:inline distT="0" distB="0" distL="0" distR="0" wp14:anchorId="4B665B8A" wp14:editId="079934F7">
             <wp:extent cx="5376333" cy="3225800"/>
             <wp:effectExtent l="0" t="0" r="0" b="0"/>
             <wp:docPr id="641952518" name="Picture 2"/>
@@ -2039,7 +2027,7 @@
           <w:noProof/>
         </w:rPr>
         <w:drawing>
-          <wp:inline distT="0" distB="0" distL="0" distR="0" wp14:anchorId="19C2E276" wp14:editId="0326F00D">
+          <wp:inline distT="0" distB="0" distL="0" distR="0" wp14:anchorId="19C2E276" wp14:editId="1AFD6F08">
             <wp:extent cx="5376333" cy="3225800"/>
             <wp:effectExtent l="0" t="0" r="0" b="0"/>
             <wp:docPr id="1359493987" name="Picture 3"/>
@@ -2697,16 +2685,7 @@
         <w:t xml:space="preserve"> We will not enforce adherence to ATLS</w:t>
       </w:r>
       <w:r>
-        <w:t>®</w:t>
-      </w:r>
-      <w:r>
-        <w:t>, as this study is of real-world effectiveness of ATLS</w:t>
-      </w:r>
-      <w:r>
-        <w:t>®</w:t>
-      </w:r>
-      <w:r>
-        <w:t xml:space="preserve"> rather than efficacy.</w:t>
+        <w:t>®, as this study is of real-world effectiveness of ATLS® rather than efficacy.</w:t>
       </w:r>
     </w:p>
     <w:p>
@@ -5301,22 +5280,10 @@
     </w:p>
     <w:p>
       <w:r>
-        <w:t>Patients included for measurement of the secondary outcomes a</w:t>
-      </w:r>
-      <w:r>
-        <w:t xml:space="preserve">dherence to ATLS® principles, quality of life, and disability </w:t>
-      </w:r>
-      <w:r>
-        <w:t xml:space="preserve">under the nested staircase design will </w:t>
-      </w:r>
-      <w:r>
-        <w:t xml:space="preserve">constitute a random subset of patients included during the staircase months. The random subset will be selected using simple random sampling at the shift level, meaning that the timing of the clinical research coordinator's shift will be randomised to cover approximately eight hours during the morning, afternoon, or night shift. </w:t>
-      </w:r>
-      <w:r>
-        <w:t>ATLS®</w:t>
-      </w:r>
-      <w:r>
-        <w:t xml:space="preserve"> adherence </w:t>
+        <w:t xml:space="preserve">Patients included for measurement of the secondary outcomes adherence to ATLS® principles, quality of life, and disability under the nested staircase design will constitute a random subset of patients included during the staircase months. The random subset will be selected using simple random sampling at the shift level, meaning that the timing of the clinical research coordinator's shift will be randomised to cover approximately eight hours during the morning, afternoon, or night shift. </w:t>
+      </w:r>
+      <w:r>
+        <w:t xml:space="preserve">ATLS® adherence </w:t>
       </w:r>
       <w:r>
         <w:t xml:space="preserve">will be </w:t>
@@ -5328,16 +5295,7 @@
         <w:t xml:space="preserve"> for all patients included during these shifts. </w:t>
       </w:r>
       <w:r>
-        <w:t>Q</w:t>
-      </w:r>
-      <w:r>
-        <w:t>uality of life and disability</w:t>
-      </w:r>
-      <w:r>
-        <w:t xml:space="preserve"> will be recorded for all patients included during the days of the randomised shifts.</w:t>
-      </w:r>
-      <w:r>
-        <w:t xml:space="preserve"> </w:t>
+        <w:t xml:space="preserve">Quality of life and disability will be recorded for all patients included during the days of the randomised shifts. </w:t>
       </w:r>
       <w:r>
         <w:t>In each hospital, the number of shifts that will be randomised will be determined by the volume of patients included during the months preceding the staircase months.</w:t>
@@ -5460,19 +5418,7 @@
         <w:rPr>
           <w:lang w:bidi="hi-IN"/>
         </w:rPr>
-        <w:t xml:space="preserve">be published online prior to the </w:t>
-      </w:r>
-      <w:r>
-        <w:rPr>
-          <w:lang w:bidi="hi-IN"/>
-        </w:rPr>
-        <w:t xml:space="preserve">trial </w:t>
-      </w:r>
-      <w:r>
-        <w:rPr>
-          <w:lang w:bidi="hi-IN"/>
-        </w:rPr>
-        <w:t>statistician receiving any data.</w:t>
+        <w:t>be published online prior to the trial statistician receiving any data.</w:t>
       </w:r>
     </w:p>
     <w:p>
@@ -5625,19 +5571,7 @@
         <w:rPr>
           <w:lang w:val="en-GB"/>
         </w:rPr>
-        <w:t xml:space="preserve">, at least three calls are attempted. Depending on the response, a subsequent call </w:t>
-      </w:r>
-      <w:r>
-        <w:rPr>
-          <w:lang w:val="en-GB"/>
-        </w:rPr>
-        <w:t xml:space="preserve">to complete the follow-up may </w:t>
-      </w:r>
-      <w:r>
-        <w:rPr>
-          <w:lang w:val="en-GB"/>
-        </w:rPr>
-        <w:t>be scheduled. In cases where no contact can be established despite repeated attempts, the participant is classified as los</w:t>
+        <w:t>, at least three calls are attempted. Depending on the response, a subsequent call to complete the follow-up may be scheduled. In cases where no contact can be established despite repeated attempts, the participant is classified as los</w:t>
       </w:r>
       <w:r>
         <w:rPr>
@@ -5844,13 +5778,7 @@
         <w:t xml:space="preserve">We will include fixed effects for period and a fixed effect for intervention exposure. The primary analysis will allow for clustering as a random cluster and random cluster by period effect. To correct potential inflation of the type I error rate due to the small number of clusters, a correction for a small number of clusters will be applied. </w:t>
       </w:r>
       <w:r>
-        <w:t xml:space="preserve">Our primary method will be </w:t>
-      </w:r>
-      <w:r>
-        <w:t>a Kenward Roger correction</w:t>
-      </w:r>
-      <w:r>
-        <w:t xml:space="preserve"> </w:t>
+        <w:t xml:space="preserve">Our primary method will be a Kenward Roger correction </w:t>
       </w:r>
       <w:r>
         <w:fldChar w:fldCharType="begin"/>
@@ -7000,97 +6928,7 @@
           <w:lang w:val="en-GB"/>
         </w:rPr>
         <w:tab/>
-        <w:t xml:space="preserve">Rauf R, von Matthey F, </w:t>
-      </w:r>
-      <w:proofErr w:type="spellStart"/>
-      <w:r>
-        <w:rPr>
-          <w:rFonts w:eastAsia="Arial Unicode MS"/>
-          <w:bdr w:val="nil"/>
-          <w:lang w:val="en-GB"/>
-        </w:rPr>
-        <w:t>Croenlein</w:t>
-      </w:r>
-      <w:proofErr w:type="spellEnd"/>
-      <w:r>
-        <w:rPr>
-          <w:rFonts w:eastAsia="Arial Unicode MS"/>
-          <w:bdr w:val="nil"/>
-          <w:lang w:val="en-GB"/>
-        </w:rPr>
-        <w:t xml:space="preserve"> M, Zyskowski M, van </w:t>
-      </w:r>
-      <w:proofErr w:type="spellStart"/>
-      <w:r>
-        <w:rPr>
-          <w:rFonts w:eastAsia="Arial Unicode MS"/>
-          <w:bdr w:val="nil"/>
-          <w:lang w:val="en-GB"/>
-        </w:rPr>
-        <w:t>Griensven</w:t>
-      </w:r>
-      <w:proofErr w:type="spellEnd"/>
-      <w:r>
-        <w:rPr>
-          <w:rFonts w:eastAsia="Arial Unicode MS"/>
-          <w:bdr w:val="nil"/>
-          <w:lang w:val="en-GB"/>
-        </w:rPr>
-        <w:t xml:space="preserve"> M, </w:t>
-      </w:r>
-      <w:proofErr w:type="spellStart"/>
-      <w:r>
-        <w:rPr>
-          <w:rFonts w:eastAsia="Arial Unicode MS"/>
-          <w:bdr w:val="nil"/>
-          <w:lang w:val="en-GB"/>
-        </w:rPr>
-        <w:t>Biberthaler</w:t>
-      </w:r>
-      <w:proofErr w:type="spellEnd"/>
-      <w:r>
-        <w:rPr>
-          <w:rFonts w:eastAsia="Arial Unicode MS"/>
-          <w:bdr w:val="nil"/>
-          <w:lang w:val="en-GB"/>
-        </w:rPr>
-        <w:t xml:space="preserve"> P, et al. Changes in the temporal distribution of in-hospital mortality in severely injured patients—An analysis of the </w:t>
-      </w:r>
-      <w:proofErr w:type="spellStart"/>
-      <w:r>
-        <w:rPr>
-          <w:rFonts w:eastAsia="Arial Unicode MS"/>
-          <w:bdr w:val="nil"/>
-          <w:lang w:val="en-GB"/>
-        </w:rPr>
-        <w:t>TraumaRegister</w:t>
-      </w:r>
-      <w:proofErr w:type="spellEnd"/>
-      <w:r>
-        <w:rPr>
-          <w:rFonts w:eastAsia="Arial Unicode MS"/>
-          <w:bdr w:val="nil"/>
-          <w:lang w:val="en-GB"/>
-        </w:rPr>
-        <w:t xml:space="preserve"> DGU. Patman S, editor. PLOS ONE. 2019 Feb;14(2</w:t>
-      </w:r>
-      <w:proofErr w:type="gramStart"/>
-      <w:r>
-        <w:rPr>
-          <w:rFonts w:eastAsia="Arial Unicode MS"/>
-          <w:bdr w:val="nil"/>
-          <w:lang w:val="en-GB"/>
-        </w:rPr>
-        <w:t>):e</w:t>
-      </w:r>
-      <w:proofErr w:type="gramEnd"/>
-      <w:r>
-        <w:rPr>
-          <w:rFonts w:eastAsia="Arial Unicode MS"/>
-          <w:bdr w:val="nil"/>
-          <w:lang w:val="en-GB"/>
-        </w:rPr>
-        <w:t xml:space="preserve">0212095. </w:t>
+        <w:t xml:space="preserve">Rauf R, von Matthey F, Croenlein M, Zyskowski M, van Griensven M, Biberthaler P, et al. Changes in the temporal distribution of in-hospital mortality in severely injured patients—An analysis of the TraumaRegister DGU. Patman S, editor. PLOS ONE. 2019 Feb;14(2):e0212095. </w:t>
       </w:r>
     </w:p>
     <w:p>
@@ -7118,61 +6956,7 @@
           <w:lang w:val="en-GB"/>
         </w:rPr>
         <w:tab/>
-        <w:t xml:space="preserve">Roy N, </w:t>
-      </w:r>
-      <w:proofErr w:type="spellStart"/>
-      <w:r>
-        <w:rPr>
-          <w:rFonts w:eastAsia="Arial Unicode MS"/>
-          <w:bdr w:val="nil"/>
-          <w:lang w:val="en-GB"/>
-        </w:rPr>
-        <w:t>Kizhakke</w:t>
-      </w:r>
-      <w:proofErr w:type="spellEnd"/>
-      <w:r>
-        <w:rPr>
-          <w:rFonts w:eastAsia="Arial Unicode MS"/>
-          <w:bdr w:val="nil"/>
-          <w:lang w:val="en-GB"/>
-        </w:rPr>
-        <w:t xml:space="preserve"> </w:t>
-      </w:r>
-      <w:proofErr w:type="spellStart"/>
-      <w:r>
-        <w:rPr>
-          <w:rFonts w:eastAsia="Arial Unicode MS"/>
-          <w:bdr w:val="nil"/>
-          <w:lang w:val="en-GB"/>
-        </w:rPr>
-        <w:t>Veetil</w:t>
-      </w:r>
-      <w:proofErr w:type="spellEnd"/>
-      <w:r>
-        <w:rPr>
-          <w:rFonts w:eastAsia="Arial Unicode MS"/>
-          <w:bdr w:val="nil"/>
-          <w:lang w:val="en-GB"/>
-        </w:rPr>
-        <w:t xml:space="preserve"> D, </w:t>
-      </w:r>
-      <w:proofErr w:type="spellStart"/>
-      <w:r>
-        <w:rPr>
-          <w:rFonts w:eastAsia="Arial Unicode MS"/>
-          <w:bdr w:val="nil"/>
-          <w:lang w:val="en-GB"/>
-        </w:rPr>
-        <w:t>Khajanchi</w:t>
-      </w:r>
-      <w:proofErr w:type="spellEnd"/>
-      <w:r>
-        <w:rPr>
-          <w:rFonts w:eastAsia="Arial Unicode MS"/>
-          <w:bdr w:val="nil"/>
-          <w:lang w:val="en-GB"/>
-        </w:rPr>
-        <w:t xml:space="preserve"> MU, Kumar V, Solomon H, Kamble J, et al. Learning from 2523 trauma deaths in India- opportunities to prevent in-hospital deaths. BMC Health Services Research [Internet]. 2017 Feb;17(1). Available from: http://dx.doi.org/10.1186/s12913-017-2085-7</w:t>
+        <w:t>Roy N, Kizhakke Veetil D, Khajanchi MU, Kumar V, Solomon H, Kamble J, et al. Learning from 2523 trauma deaths in India- opportunities to prevent in-hospital deaths. BMC Health Services Research [Internet]. 2017 Feb;17(1). Available from: http://dx.doi.org/10.1186/s12913-017-2085-7</w:t>
       </w:r>
     </w:p>
     <w:p>
@@ -7199,78 +6983,7 @@
           <w:lang w:val="en-GB"/>
         </w:rPr>
         <w:tab/>
-      </w:r>
-      <w:proofErr w:type="spellStart"/>
-      <w:r>
-        <w:rPr>
-          <w:rFonts w:eastAsia="Arial Unicode MS"/>
-          <w:bdr w:val="nil"/>
-          <w:lang w:val="en-GB"/>
-        </w:rPr>
-        <w:t>Callcut</w:t>
-      </w:r>
-      <w:proofErr w:type="spellEnd"/>
-      <w:r>
-        <w:rPr>
-          <w:rFonts w:eastAsia="Arial Unicode MS"/>
-          <w:bdr w:val="nil"/>
-          <w:lang w:val="en-GB"/>
-        </w:rPr>
-        <w:t xml:space="preserve"> RA, </w:t>
-      </w:r>
-      <w:proofErr w:type="spellStart"/>
-      <w:r>
-        <w:rPr>
-          <w:rFonts w:eastAsia="Arial Unicode MS"/>
-          <w:bdr w:val="nil"/>
-          <w:lang w:val="en-GB"/>
-        </w:rPr>
-        <w:t>Kornblith</w:t>
-      </w:r>
-      <w:proofErr w:type="spellEnd"/>
-      <w:r>
-        <w:rPr>
-          <w:rFonts w:eastAsia="Arial Unicode MS"/>
-          <w:bdr w:val="nil"/>
-          <w:lang w:val="en-GB"/>
-        </w:rPr>
-        <w:t xml:space="preserve"> LZ, Conroy AS, Robles AJ, </w:t>
-      </w:r>
-      <w:proofErr w:type="spellStart"/>
-      <w:r>
-        <w:rPr>
-          <w:rFonts w:eastAsia="Arial Unicode MS"/>
-          <w:bdr w:val="nil"/>
-          <w:lang w:val="en-GB"/>
-        </w:rPr>
-        <w:t>Meizoso</w:t>
-      </w:r>
-      <w:proofErr w:type="spellEnd"/>
-      <w:r>
-        <w:rPr>
-          <w:rFonts w:eastAsia="Arial Unicode MS"/>
-          <w:bdr w:val="nil"/>
-          <w:lang w:val="en-GB"/>
-        </w:rPr>
-        <w:t xml:space="preserve"> JP, Namias N, et al. The why and how our trauma patients die: A prospective </w:t>
-      </w:r>
-      <w:proofErr w:type="spellStart"/>
-      <w:r>
-        <w:rPr>
-          <w:rFonts w:eastAsia="Arial Unicode MS"/>
-          <w:bdr w:val="nil"/>
-          <w:lang w:val="en-GB"/>
-        </w:rPr>
-        <w:t>Multicenter</w:t>
-      </w:r>
-      <w:proofErr w:type="spellEnd"/>
-      <w:r>
-        <w:rPr>
-          <w:rFonts w:eastAsia="Arial Unicode MS"/>
-          <w:bdr w:val="nil"/>
-          <w:lang w:val="en-GB"/>
-        </w:rPr>
-        <w:t xml:space="preserve"> Western Trauma Association study. J Trauma Acute Care Surg. 2019 May;86(5):864–70. </w:t>
+        <w:t xml:space="preserve">Callcut RA, Kornblith LZ, Conroy AS, Robles AJ, Meizoso JP, Namias N, et al. The why and how our trauma patients die: A prospective Multicenter Western Trauma Association study. J Trauma Acute Care Surg. 2019 May;86(5):864–70. </w:t>
       </w:r>
     </w:p>
     <w:p>
@@ -7297,61 +7010,7 @@
           <w:lang w:val="en-GB"/>
         </w:rPr>
         <w:tab/>
-        <w:t xml:space="preserve">Ghorbani P, </w:t>
-      </w:r>
-      <w:proofErr w:type="spellStart"/>
-      <w:r>
-        <w:rPr>
-          <w:rFonts w:eastAsia="Arial Unicode MS"/>
-          <w:bdr w:val="nil"/>
-          <w:lang w:val="en-GB"/>
-        </w:rPr>
-        <w:t>Strömmer</w:t>
-      </w:r>
-      <w:proofErr w:type="spellEnd"/>
-      <w:r>
-        <w:rPr>
-          <w:rFonts w:eastAsia="Arial Unicode MS"/>
-          <w:bdr w:val="nil"/>
-          <w:lang w:val="en-GB"/>
-        </w:rPr>
-        <w:t xml:space="preserve"> L. Analysis of preventable deaths and errors in trauma care in a Scandinavian trauma </w:t>
-      </w:r>
-      <w:proofErr w:type="gramStart"/>
-      <w:r>
-        <w:rPr>
-          <w:rFonts w:eastAsia="Arial Unicode MS"/>
-          <w:bdr w:val="nil"/>
-          <w:lang w:val="en-GB"/>
-        </w:rPr>
-        <w:t>level-I</w:t>
-      </w:r>
-      <w:proofErr w:type="gramEnd"/>
-      <w:r>
-        <w:rPr>
-          <w:rFonts w:eastAsia="Arial Unicode MS"/>
-          <w:bdr w:val="nil"/>
-          <w:lang w:val="en-GB"/>
-        </w:rPr>
-        <w:t xml:space="preserve"> centre. Acta </w:t>
-      </w:r>
-      <w:proofErr w:type="spellStart"/>
-      <w:r>
-        <w:rPr>
-          <w:rFonts w:eastAsia="Arial Unicode MS"/>
-          <w:bdr w:val="nil"/>
-          <w:lang w:val="en-GB"/>
-        </w:rPr>
-        <w:t>Anaesthesiologica</w:t>
-      </w:r>
-      <w:proofErr w:type="spellEnd"/>
-      <w:r>
-        <w:rPr>
-          <w:rFonts w:eastAsia="Arial Unicode MS"/>
-          <w:bdr w:val="nil"/>
-          <w:lang w:val="en-GB"/>
-        </w:rPr>
-        <w:t xml:space="preserve"> Scandinavica. 2018 May;62(8):1146–53. </w:t>
+        <w:t xml:space="preserve">Ghorbani P, Strömmer L. Analysis of preventable deaths and errors in trauma care in a Scandinavian trauma level-I centre. Acta Anaesthesiologica Scandinavica. 2018 May;62(8):1146–53. </w:t>
       </w:r>
     </w:p>
     <w:p>
@@ -7378,25 +7037,7 @@
           <w:lang w:val="en-GB"/>
         </w:rPr>
         <w:tab/>
-        <w:t xml:space="preserve">Mohammad A, </w:t>
-      </w:r>
-      <w:proofErr w:type="spellStart"/>
-      <w:r>
-        <w:rPr>
-          <w:rFonts w:eastAsia="Arial Unicode MS"/>
-          <w:bdr w:val="nil"/>
-          <w:lang w:val="en-GB"/>
-        </w:rPr>
-        <w:t>Branicki</w:t>
-      </w:r>
-      <w:proofErr w:type="spellEnd"/>
-      <w:r>
-        <w:rPr>
-          <w:rFonts w:eastAsia="Arial Unicode MS"/>
-          <w:bdr w:val="nil"/>
-          <w:lang w:val="en-GB"/>
-        </w:rPr>
-        <w:t xml:space="preserve"> F, Abu-Zidan FM. Educational and Clinical Impact of Advanced Trauma Life Support (ATLS) Courses: A Systematic Review. World Journal of Surgery. 2013 Oct;38(2):322–9. </w:t>
+        <w:t xml:space="preserve">Mohammad A, Branicki F, Abu-Zidan FM. Educational and Clinical Impact of Advanced Trauma Life Support (ATLS) Courses: A Systematic Review. World Journal of Surgery. 2013 Oct;38(2):322–9. </w:t>
       </w:r>
     </w:p>
     <w:p>
@@ -7477,43 +7118,7 @@
           <w:lang w:val="en-GB"/>
         </w:rPr>
         <w:tab/>
-        <w:t xml:space="preserve">Jin J, </w:t>
-      </w:r>
-      <w:proofErr w:type="spellStart"/>
-      <w:r>
-        <w:rPr>
-          <w:rFonts w:eastAsia="Arial Unicode MS"/>
-          <w:bdr w:val="nil"/>
-          <w:lang w:val="en-GB"/>
-        </w:rPr>
-        <w:t>Akau’ola</w:t>
-      </w:r>
-      <w:proofErr w:type="spellEnd"/>
-      <w:r>
-        <w:rPr>
-          <w:rFonts w:eastAsia="Arial Unicode MS"/>
-          <w:bdr w:val="nil"/>
-          <w:lang w:val="en-GB"/>
-        </w:rPr>
-        <w:t xml:space="preserve"> S, Yip CH, </w:t>
-      </w:r>
-      <w:proofErr w:type="spellStart"/>
-      <w:r>
-        <w:rPr>
-          <w:rFonts w:eastAsia="Arial Unicode MS"/>
-          <w:bdr w:val="nil"/>
-          <w:lang w:val="en-GB"/>
-        </w:rPr>
-        <w:t>Nthumba</w:t>
-      </w:r>
-      <w:proofErr w:type="spellEnd"/>
-      <w:r>
-        <w:rPr>
-          <w:rFonts w:eastAsia="Arial Unicode MS"/>
-          <w:bdr w:val="nil"/>
-          <w:lang w:val="en-GB"/>
-        </w:rPr>
-        <w:t xml:space="preserve"> P, Ameh EA, de Jonge S, et al. Effectiveness of Quality Improvement Processes, Interventions, and Structure in Trauma Systems in Low- and Middle-Income Countries: A Systematic Review and Meta-analysis. World Journal of Surgery. 2021 Apr;45(7):1982–98. </w:t>
+        <w:t xml:space="preserve">Jin J, Akau’ola S, Yip CH, Nthumba P, Ameh EA, de Jonge S, et al. Effectiveness of Quality Improvement Processes, Interventions, and Structure in Trauma Systems in Low- and Middle-Income Countries: A Systematic Review and Meta-analysis. World Journal of Surgery. 2021 Apr;45(7):1982–98. </w:t>
       </w:r>
     </w:p>
     <w:p>
@@ -7567,25 +7172,7 @@
           <w:lang w:val="en-GB"/>
         </w:rPr>
         <w:tab/>
-        <w:t xml:space="preserve">American College of Surgeons C on T. Advanced Trauma Life Support® Student Course Manual. 10th </w:t>
-      </w:r>
-      <w:proofErr w:type="spellStart"/>
-      <w:r>
-        <w:rPr>
-          <w:rFonts w:eastAsia="Arial Unicode MS"/>
-          <w:bdr w:val="nil"/>
-          <w:lang w:val="en-GB"/>
-        </w:rPr>
-        <w:t>edn</w:t>
-      </w:r>
-      <w:proofErr w:type="spellEnd"/>
-      <w:r>
-        <w:rPr>
-          <w:rFonts w:eastAsia="Arial Unicode MS"/>
-          <w:bdr w:val="nil"/>
-          <w:lang w:val="en-GB"/>
-        </w:rPr>
-        <w:t xml:space="preserve">. 633 N. Saint Clair Street, Chicago, IL 60611-3211: American College of Surgeons; 2018. </w:t>
+        <w:t xml:space="preserve">American College of Surgeons C on T. Advanced Trauma Life Support® Student Course Manual. 10th edn. 633 N. Saint Clair Street, Chicago, IL 60611-3211: American College of Surgeons; 2018. </w:t>
       </w:r>
     </w:p>
     <w:p>
@@ -7666,25 +7253,7 @@
           <w:lang w:val="en-GB"/>
         </w:rPr>
         <w:tab/>
-        <w:t xml:space="preserve">Ali J, Cohen R, Adam R, Theophilus J. G, Pierre I, </w:t>
-      </w:r>
-      <w:proofErr w:type="spellStart"/>
-      <w:r>
-        <w:rPr>
-          <w:rFonts w:eastAsia="Arial Unicode MS"/>
-          <w:bdr w:val="nil"/>
-          <w:lang w:val="en-GB"/>
-        </w:rPr>
-        <w:t>Bedaysie</w:t>
-      </w:r>
-      <w:proofErr w:type="spellEnd"/>
-      <w:r>
-        <w:rPr>
-          <w:rFonts w:eastAsia="Arial Unicode MS"/>
-          <w:bdr w:val="nil"/>
-          <w:lang w:val="en-GB"/>
-        </w:rPr>
-        <w:t xml:space="preserve"> H, et al. Teaching Effectiveness of the Advanced Trauma Life Support Program as Demonstrated by an Objective Structured Clinical Examination for Practicing Physicians. World Journal of Surgery. 1996 Oct;20(8):1121–6. </w:t>
+        <w:t xml:space="preserve">Ali J, Cohen R, Adam R, Theophilus J. G, Pierre I, Bedaysie H, et al. Teaching Effectiveness of the Advanced Trauma Life Support Program as Demonstrated by an Objective Structured Clinical Examination for Practicing Physicians. World Journal of Surgery. 1996 Oct;20(8):1121–6. </w:t>
       </w:r>
     </w:p>
     <w:p>
@@ -7711,25 +7280,7 @@
           <w:lang w:val="en-GB"/>
         </w:rPr>
         <w:tab/>
-        <w:t xml:space="preserve">Ali J, Adam RU, Josa D, Pierre I, </w:t>
-      </w:r>
-      <w:proofErr w:type="spellStart"/>
-      <w:r>
-        <w:rPr>
-          <w:rFonts w:eastAsia="Arial Unicode MS"/>
-          <w:bdr w:val="nil"/>
-          <w:lang w:val="en-GB"/>
-        </w:rPr>
-        <w:t>Bedaysie</w:t>
-      </w:r>
-      <w:proofErr w:type="spellEnd"/>
-      <w:r>
-        <w:rPr>
-          <w:rFonts w:eastAsia="Arial Unicode MS"/>
-          <w:bdr w:val="nil"/>
-          <w:lang w:val="en-GB"/>
-        </w:rPr>
-        <w:t xml:space="preserve"> H, West U, et al. Comparison of Performance of Interns Completing the Old (1993) and New Interactive (1997) Advanced Trauma Life Support Courses. The Journal of Trauma: Injury, Infection, and Critical Care. 1999 Jan;46(1):80–6. </w:t>
+        <w:t xml:space="preserve">Ali J, Adam RU, Josa D, Pierre I, Bedaysie H, West U, et al. Comparison of Performance of Interns Completing the Old (1993) and New Interactive (1997) Advanced Trauma Life Support Courses. The Journal of Trauma: Injury, Infection, and Critical Care. 1999 Jan;46(1):80–6. </w:t>
       </w:r>
     </w:p>
     <w:p>
@@ -7757,97 +7308,7 @@
           <w:lang w:val="en-GB"/>
         </w:rPr>
         <w:tab/>
-        <w:t xml:space="preserve">Putra AB, </w:t>
-      </w:r>
-      <w:proofErr w:type="spellStart"/>
-      <w:r>
-        <w:rPr>
-          <w:rFonts w:eastAsia="Arial Unicode MS"/>
-          <w:bdr w:val="nil"/>
-          <w:lang w:val="en-GB"/>
-        </w:rPr>
-        <w:t>Nurachman</w:t>
-      </w:r>
-      <w:proofErr w:type="spellEnd"/>
-      <w:r>
-        <w:rPr>
-          <w:rFonts w:eastAsia="Arial Unicode MS"/>
-          <w:bdr w:val="nil"/>
-          <w:lang w:val="en-GB"/>
-        </w:rPr>
-        <w:t xml:space="preserve"> LA, </w:t>
-      </w:r>
-      <w:proofErr w:type="spellStart"/>
-      <w:r>
-        <w:rPr>
-          <w:rFonts w:eastAsia="Arial Unicode MS"/>
-          <w:bdr w:val="nil"/>
-          <w:lang w:val="en-GB"/>
-        </w:rPr>
-        <w:t>Suryawiditya</w:t>
-      </w:r>
-      <w:proofErr w:type="spellEnd"/>
-      <w:r>
-        <w:rPr>
-          <w:rFonts w:eastAsia="Arial Unicode MS"/>
-          <w:bdr w:val="nil"/>
-          <w:lang w:val="en-GB"/>
-        </w:rPr>
-        <w:t xml:space="preserve"> BA, </w:t>
-      </w:r>
-      <w:proofErr w:type="spellStart"/>
-      <w:r>
-        <w:rPr>
-          <w:rFonts w:eastAsia="Arial Unicode MS"/>
-          <w:bdr w:val="nil"/>
-          <w:lang w:val="en-GB"/>
-        </w:rPr>
-        <w:t>Risyaldi</w:t>
-      </w:r>
-      <w:proofErr w:type="spellEnd"/>
-      <w:r>
-        <w:rPr>
-          <w:rFonts w:eastAsia="Arial Unicode MS"/>
-          <w:bdr w:val="nil"/>
-          <w:lang w:val="en-GB"/>
-        </w:rPr>
-        <w:t xml:space="preserve"> M, </w:t>
-      </w:r>
-      <w:proofErr w:type="spellStart"/>
-      <w:r>
-        <w:rPr>
-          <w:rFonts w:eastAsia="Arial Unicode MS"/>
-          <w:bdr w:val="nil"/>
-          <w:lang w:val="en-GB"/>
-        </w:rPr>
-        <w:t>Sihardo</w:t>
-      </w:r>
-      <w:proofErr w:type="spellEnd"/>
-      <w:r>
-        <w:rPr>
-          <w:rFonts w:eastAsia="Arial Unicode MS"/>
-          <w:bdr w:val="nil"/>
-          <w:lang w:val="en-GB"/>
-        </w:rPr>
-        <w:t xml:space="preserve"> L. Impact of Advanced Trauma Life Support Training for Improving Mortality Outcome: A Systematic Review and Meta-analysis. The New </w:t>
-      </w:r>
-      <w:proofErr w:type="spellStart"/>
-      <w:r>
-        <w:rPr>
-          <w:rFonts w:eastAsia="Arial Unicode MS"/>
-          <w:bdr w:val="nil"/>
-          <w:lang w:val="en-GB"/>
-        </w:rPr>
-        <w:t>Ropanasury</w:t>
-      </w:r>
-      <w:proofErr w:type="spellEnd"/>
-      <w:r>
-        <w:rPr>
-          <w:rFonts w:eastAsia="Arial Unicode MS"/>
-          <w:bdr w:val="nil"/>
-          <w:lang w:val="en-GB"/>
-        </w:rPr>
-        <w:t xml:space="preserve"> Journal of Surgery [Internet]. 2023 June;8(2). Available from: http://dx.doi.org/10.7454/nrjs.v8i2.1152</w:t>
+        <w:t>Putra AB, Nurachman LA, Suryawiditya BA, Risyaldi M, Sihardo L. Impact of Advanced Trauma Life Support Training for Improving Mortality Outcome: A Systematic Review and Meta-analysis. The New Ropanasury Journal of Surgery [Internet]. 2023 June;8(2). Available from: http://dx.doi.org/10.7454/nrjs.v8i2.1152</w:t>
       </w:r>
     </w:p>
     <w:p>
@@ -7874,25 +7335,7 @@
           <w:lang w:val="en-GB"/>
         </w:rPr>
         <w:tab/>
-        <w:t xml:space="preserve">Vestrup JA, </w:t>
-      </w:r>
-      <w:proofErr w:type="spellStart"/>
-      <w:r>
-        <w:rPr>
-          <w:rFonts w:eastAsia="Arial Unicode MS"/>
-          <w:bdr w:val="nil"/>
-          <w:lang w:val="en-GB"/>
-        </w:rPr>
-        <w:t>Stormorken</w:t>
-      </w:r>
-      <w:proofErr w:type="spellEnd"/>
-      <w:r>
-        <w:rPr>
-          <w:rFonts w:eastAsia="Arial Unicode MS"/>
-          <w:bdr w:val="nil"/>
-          <w:lang w:val="en-GB"/>
-        </w:rPr>
-        <w:t xml:space="preserve"> A, Wood V. Impact of advanced trauma life support training on early trauma management. The American Journal of Surgery. 1988 May;155(5):704–7. </w:t>
+        <w:t xml:space="preserve">Vestrup JA, Stormorken A, Wood V. Impact of advanced trauma life support training on early trauma management. The American Journal of Surgery. 1988 May;155(5):704–7. </w:t>
       </w:r>
     </w:p>
     <w:p>
@@ -7946,25 +7389,7 @@
           <w:lang w:val="en-GB"/>
         </w:rPr>
         <w:tab/>
-        <w:t xml:space="preserve">van Olden GDJ, Dik Meeuwis J, Bolhuis HW, </w:t>
-      </w:r>
-      <w:proofErr w:type="spellStart"/>
-      <w:r>
-        <w:rPr>
-          <w:rFonts w:eastAsia="Arial Unicode MS"/>
-          <w:bdr w:val="nil"/>
-          <w:lang w:val="en-GB"/>
-        </w:rPr>
-        <w:t>Boxma</w:t>
-      </w:r>
-      <w:proofErr w:type="spellEnd"/>
-      <w:r>
-        <w:rPr>
-          <w:rFonts w:eastAsia="Arial Unicode MS"/>
-          <w:bdr w:val="nil"/>
-          <w:lang w:val="en-GB"/>
-        </w:rPr>
-        <w:t xml:space="preserve"> H, Goris RJA. Clinical impact of advanced trauma life support. The American Journal of Emergency Medicine. 2004 Nov;22(7):522–5. </w:t>
+        <w:t xml:space="preserve">van Olden GDJ, Dik Meeuwis J, Bolhuis HW, Boxma H, Goris RJA. Clinical impact of advanced trauma life support. The American Journal of Emergency Medicine. 2004 Nov;22(7):522–5. </w:t>
       </w:r>
     </w:p>
     <w:p>
@@ -8045,25 +7470,7 @@
           <w:lang w:val="en-GB"/>
         </w:rPr>
         <w:tab/>
-        <w:t xml:space="preserve">Hashmi ZG, Haider AH, Zafar SN, </w:t>
-      </w:r>
-      <w:proofErr w:type="spellStart"/>
-      <w:r>
-        <w:rPr>
-          <w:rFonts w:eastAsia="Arial Unicode MS"/>
-          <w:bdr w:val="nil"/>
-          <w:lang w:val="en-GB"/>
-        </w:rPr>
-        <w:t>Kisat</w:t>
-      </w:r>
-      <w:proofErr w:type="spellEnd"/>
-      <w:r>
-        <w:rPr>
-          <w:rFonts w:eastAsia="Arial Unicode MS"/>
-          <w:bdr w:val="nil"/>
-          <w:lang w:val="en-GB"/>
-        </w:rPr>
-        <w:t xml:space="preserve"> M, Moosa A, Siddiqui F, et al. Hospital-based trauma quality improvement initiatives: First step toward improving trauma outcomes in the developing world. Journal of Trauma and Acute Care Surgery. 2013 July;75(1):60–8. </w:t>
+        <w:t xml:space="preserve">Hashmi ZG, Haider AH, Zafar SN, Kisat M, Moosa A, Siddiqui F, et al. Hospital-based trauma quality improvement initiatives: First step toward improving trauma outcomes in the developing world. Journal of Trauma and Acute Care Surgery. 2013 July;75(1):60–8. </w:t>
       </w:r>
     </w:p>
     <w:p>
@@ -8090,60 +7497,7 @@
           <w:lang w:val="en-GB"/>
         </w:rPr>
         <w:tab/>
-      </w:r>
-      <w:proofErr w:type="spellStart"/>
-      <w:r>
-        <w:rPr>
-          <w:rFonts w:eastAsia="Arial Unicode MS"/>
-          <w:bdr w:val="nil"/>
-          <w:lang w:val="en-GB"/>
-        </w:rPr>
-        <w:t>Petroze</w:t>
-      </w:r>
-      <w:proofErr w:type="spellEnd"/>
-      <w:r>
-        <w:rPr>
-          <w:rFonts w:eastAsia="Arial Unicode MS"/>
-          <w:bdr w:val="nil"/>
-          <w:lang w:val="en-GB"/>
-        </w:rPr>
-        <w:t xml:space="preserve"> RT, </w:t>
-      </w:r>
-      <w:proofErr w:type="spellStart"/>
-      <w:r>
-        <w:rPr>
-          <w:rFonts w:eastAsia="Arial Unicode MS"/>
-          <w:bdr w:val="nil"/>
-          <w:lang w:val="en-GB"/>
-        </w:rPr>
-        <w:t>Byiringiro</w:t>
-      </w:r>
-      <w:proofErr w:type="spellEnd"/>
-      <w:r>
-        <w:rPr>
-          <w:rFonts w:eastAsia="Arial Unicode MS"/>
-          <w:bdr w:val="nil"/>
-          <w:lang w:val="en-GB"/>
-        </w:rPr>
-        <w:t xml:space="preserve"> JC, </w:t>
-      </w:r>
-      <w:proofErr w:type="spellStart"/>
-      <w:r>
-        <w:rPr>
-          <w:rFonts w:eastAsia="Arial Unicode MS"/>
-          <w:bdr w:val="nil"/>
-          <w:lang w:val="en-GB"/>
-        </w:rPr>
-        <w:t>Ntakiyiruta</w:t>
-      </w:r>
-      <w:proofErr w:type="spellEnd"/>
-      <w:r>
-        <w:rPr>
-          <w:rFonts w:eastAsia="Arial Unicode MS"/>
-          <w:bdr w:val="nil"/>
-          <w:lang w:val="en-GB"/>
-        </w:rPr>
-        <w:t xml:space="preserve"> G, Briggs SM, Deckelbaum DL, Razek T, et al. Can Focused Trauma Education Initiatives Reduce Mortality or Improve Resource Utilization in a Low-Resource Setting? World Journal of Surgery. 2014 Dec;39(4):926–33. </w:t>
+        <w:t xml:space="preserve">Petroze RT, Byiringiro JC, Ntakiyiruta G, Briggs SM, Deckelbaum DL, Razek T, et al. Can Focused Trauma Education Initiatives Reduce Mortality or Improve Resource Utilization in a Low-Resource Setting? World Journal of Surgery. 2014 Dec;39(4):926–33. </w:t>
       </w:r>
     </w:p>
     <w:p>
@@ -8170,151 +7524,7 @@
           <w:lang w:val="en-GB"/>
         </w:rPr>
         <w:tab/>
-        <w:t xml:space="preserve">Bellanova G, </w:t>
-      </w:r>
-      <w:proofErr w:type="spellStart"/>
-      <w:r>
-        <w:rPr>
-          <w:rFonts w:eastAsia="Arial Unicode MS"/>
-          <w:bdr w:val="nil"/>
-          <w:lang w:val="en-GB"/>
-        </w:rPr>
-        <w:t>Buccelletti</w:t>
-      </w:r>
-      <w:proofErr w:type="spellEnd"/>
-      <w:r>
-        <w:rPr>
-          <w:rFonts w:eastAsia="Arial Unicode MS"/>
-          <w:bdr w:val="nil"/>
-          <w:lang w:val="en-GB"/>
-        </w:rPr>
-        <w:t xml:space="preserve"> F, </w:t>
-      </w:r>
-      <w:proofErr w:type="spellStart"/>
-      <w:r>
-        <w:rPr>
-          <w:rFonts w:eastAsia="Arial Unicode MS"/>
-          <w:bdr w:val="nil"/>
-          <w:lang w:val="en-GB"/>
-        </w:rPr>
-        <w:t>Berletti</w:t>
-      </w:r>
-      <w:proofErr w:type="spellEnd"/>
-      <w:r>
-        <w:rPr>
-          <w:rFonts w:eastAsia="Arial Unicode MS"/>
-          <w:bdr w:val="nil"/>
-          <w:lang w:val="en-GB"/>
-        </w:rPr>
-        <w:t xml:space="preserve"> R, </w:t>
-      </w:r>
-      <w:proofErr w:type="spellStart"/>
-      <w:r>
-        <w:rPr>
-          <w:rFonts w:eastAsia="Arial Unicode MS"/>
-          <w:bdr w:val="nil"/>
-          <w:lang w:val="en-GB"/>
-        </w:rPr>
-        <w:t>Cavana</w:t>
-      </w:r>
-      <w:proofErr w:type="spellEnd"/>
-      <w:r>
-        <w:rPr>
-          <w:rFonts w:eastAsia="Arial Unicode MS"/>
-          <w:bdr w:val="nil"/>
-          <w:lang w:val="en-GB"/>
-        </w:rPr>
-        <w:t xml:space="preserve"> M, </w:t>
-      </w:r>
-      <w:proofErr w:type="spellStart"/>
-      <w:r>
-        <w:rPr>
-          <w:rFonts w:eastAsia="Arial Unicode MS"/>
-          <w:bdr w:val="nil"/>
-          <w:lang w:val="en-GB"/>
-        </w:rPr>
-        <w:t>Folgheraiter</w:t>
-      </w:r>
-      <w:proofErr w:type="spellEnd"/>
-      <w:r>
-        <w:rPr>
-          <w:rFonts w:eastAsia="Arial Unicode MS"/>
-          <w:bdr w:val="nil"/>
-          <w:lang w:val="en-GB"/>
-        </w:rPr>
-        <w:t xml:space="preserve"> G, </w:t>
-      </w:r>
-      <w:proofErr w:type="spellStart"/>
-      <w:r>
-        <w:rPr>
-          <w:rFonts w:eastAsia="Arial Unicode MS"/>
-          <w:bdr w:val="nil"/>
-          <w:lang w:val="en-GB"/>
-        </w:rPr>
-        <w:t>Groppo</w:t>
-      </w:r>
-      <w:proofErr w:type="spellEnd"/>
-      <w:r>
-        <w:rPr>
-          <w:rFonts w:eastAsia="Arial Unicode MS"/>
-          <w:bdr w:val="nil"/>
-          <w:lang w:val="en-GB"/>
-        </w:rPr>
-        <w:t xml:space="preserve"> F, et al. </w:t>
-      </w:r>
-      <w:proofErr w:type="gramStart"/>
-      <w:r>
-        <w:rPr>
-          <w:rFonts w:eastAsia="Arial Unicode MS"/>
-          <w:bdr w:val="nil"/>
-          <w:lang w:val="en-GB"/>
-        </w:rPr>
-        <w:t>How</w:t>
-      </w:r>
-      <w:proofErr w:type="gramEnd"/>
-      <w:r>
-        <w:rPr>
-          <w:rFonts w:eastAsia="Arial Unicode MS"/>
-          <w:bdr w:val="nil"/>
-          <w:lang w:val="en-GB"/>
-        </w:rPr>
-        <w:t xml:space="preserve"> formative courses about damage control surgery and non-operative management improved outcome and survival in unstable </w:t>
-      </w:r>
-      <w:proofErr w:type="spellStart"/>
-      <w:r>
-        <w:rPr>
-          <w:rFonts w:eastAsia="Arial Unicode MS"/>
-          <w:bdr w:val="nil"/>
-          <w:lang w:val="en-GB"/>
-        </w:rPr>
-        <w:t>politrauma</w:t>
-      </w:r>
-      <w:proofErr w:type="spellEnd"/>
-      <w:r>
-        <w:rPr>
-          <w:rFonts w:eastAsia="Arial Unicode MS"/>
-          <w:bdr w:val="nil"/>
-          <w:lang w:val="en-GB"/>
-        </w:rPr>
-        <w:t xml:space="preserve"> patients in a Mountain Trauma </w:t>
-      </w:r>
-      <w:proofErr w:type="spellStart"/>
-      <w:r>
-        <w:rPr>
-          <w:rFonts w:eastAsia="Arial Unicode MS"/>
-          <w:bdr w:val="nil"/>
-          <w:lang w:val="en-GB"/>
-        </w:rPr>
-        <w:t>Center</w:t>
-      </w:r>
-      <w:proofErr w:type="spellEnd"/>
-      <w:r>
-        <w:rPr>
-          <w:rFonts w:eastAsia="Arial Unicode MS"/>
-          <w:bdr w:val="nil"/>
-          <w:lang w:val="en-GB"/>
-        </w:rPr>
-        <w:t xml:space="preserve">. Ann Ital Chir. 2016;87(1):68–74. </w:t>
+        <w:t xml:space="preserve">Bellanova G, Buccelletti F, Berletti R, Cavana M, Folgheraiter G, Groppo F, et al. How formative courses about damage control surgery and non-operative management improved outcome and survival in unstable politrauma patients in a Mountain Trauma Center. Ann Ital Chir. 2016;87(1):68–74. </w:t>
       </w:r>
     </w:p>
     <w:p>
@@ -8341,79 +7551,7 @@
           <w:lang w:val="en-GB"/>
         </w:rPr>
         <w:tab/>
-        <w:t xml:space="preserve">Magnone S, Allegri A, Belotti E, Castelli CC, </w:t>
-      </w:r>
-      <w:proofErr w:type="spellStart"/>
-      <w:r>
-        <w:rPr>
-          <w:rFonts w:eastAsia="Arial Unicode MS"/>
-          <w:bdr w:val="nil"/>
-          <w:lang w:val="en-GB"/>
-        </w:rPr>
-        <w:t>Ceresoli</w:t>
-      </w:r>
-      <w:proofErr w:type="spellEnd"/>
-      <w:r>
-        <w:rPr>
-          <w:rFonts w:eastAsia="Arial Unicode MS"/>
-          <w:bdr w:val="nil"/>
-          <w:lang w:val="en-GB"/>
-        </w:rPr>
-        <w:t xml:space="preserve"> M, </w:t>
-      </w:r>
-      <w:proofErr w:type="spellStart"/>
-      <w:r>
-        <w:rPr>
-          <w:rFonts w:eastAsia="Arial Unicode MS"/>
-          <w:bdr w:val="nil"/>
-          <w:lang w:val="en-GB"/>
-        </w:rPr>
-        <w:t>Coccolini</w:t>
-      </w:r>
-      <w:proofErr w:type="spellEnd"/>
-      <w:r>
-        <w:rPr>
-          <w:rFonts w:eastAsia="Arial Unicode MS"/>
-          <w:bdr w:val="nil"/>
-          <w:lang w:val="en-GB"/>
-        </w:rPr>
-        <w:t xml:space="preserve"> F, et al. Impact of ATLS Guidelines and Trauma Team Introduction </w:t>
-      </w:r>
-      <w:proofErr w:type="gramStart"/>
-      <w:r>
-        <w:rPr>
-          <w:rFonts w:eastAsia="Arial Unicode MS"/>
-          <w:bdr w:val="nil"/>
-          <w:lang w:val="en-GB"/>
-        </w:rPr>
-        <w:t>an</w:t>
-      </w:r>
-      <w:proofErr w:type="gramEnd"/>
-      <w:r>
-        <w:rPr>
-          <w:rFonts w:eastAsia="Arial Unicode MS"/>
-          <w:bdr w:val="nil"/>
-          <w:lang w:val="en-GB"/>
-        </w:rPr>
-        <w:t xml:space="preserve"> 24 </w:t>
-      </w:r>
-      <w:proofErr w:type="gramStart"/>
-      <w:r>
-        <w:rPr>
-          <w:rFonts w:eastAsia="Arial Unicode MS"/>
-          <w:bdr w:val="nil"/>
-          <w:lang w:val="en-GB"/>
-        </w:rPr>
-        <w:t>Hours</w:t>
-      </w:r>
-      <w:proofErr w:type="gramEnd"/>
-      <w:r>
-        <w:rPr>
-          <w:rFonts w:eastAsia="Arial Unicode MS"/>
-          <w:bdr w:val="nil"/>
-          <w:lang w:val="en-GB"/>
-        </w:rPr>
-        <w:t xml:space="preserve"> Mortality in Severe Trauma in a Busy Italian Metropolitan Hospital: a Case Control Study. Turkish Journal of Trauma and Emergency Surgery [Internet]. 2015; Available from: http://dx.doi.org/10.5505/tjtes.2015.19540</w:t>
+        <w:t>Magnone S, Allegri A, Belotti E, Castelli CC, Ceresoli M, Coccolini F, et al. Impact of ATLS Guidelines and Trauma Team Introduction an 24 Hours Mortality in Severe Trauma in a Busy Italian Metropolitan Hospital: a Case Control Study. Turkish Journal of Trauma and Emergency Surgery [Internet]. 2015; Available from: http://dx.doi.org/10.5505/tjtes.2015.19540</w:t>
       </w:r>
     </w:p>
     <w:p>
@@ -8440,43 +7578,7 @@
           <w:lang w:val="en-GB"/>
         </w:rPr>
         <w:tab/>
-        <w:t xml:space="preserve">Kamau C, </w:t>
-      </w:r>
-      <w:proofErr w:type="spellStart"/>
-      <w:r>
-        <w:rPr>
-          <w:rFonts w:eastAsia="Arial Unicode MS"/>
-          <w:bdr w:val="nil"/>
-          <w:lang w:val="en-GB"/>
-        </w:rPr>
-        <w:t>Chikophe</w:t>
-      </w:r>
-      <w:proofErr w:type="spellEnd"/>
-      <w:r>
-        <w:rPr>
-          <w:rFonts w:eastAsia="Arial Unicode MS"/>
-          <w:bdr w:val="nil"/>
-          <w:lang w:val="en-GB"/>
-        </w:rPr>
-        <w:t xml:space="preserve"> I, Abdallah A, Mogere E. Impact of advanced trauma life support training on 30-day mortality in severely injured patients at a Kenyan tertiary </w:t>
-      </w:r>
-      <w:proofErr w:type="spellStart"/>
-      <w:r>
-        <w:rPr>
-          <w:rFonts w:eastAsia="Arial Unicode MS"/>
-          <w:bdr w:val="nil"/>
-          <w:lang w:val="en-GB"/>
-        </w:rPr>
-        <w:t>center</w:t>
-      </w:r>
-      <w:proofErr w:type="spellEnd"/>
-      <w:r>
-        <w:rPr>
-          <w:rFonts w:eastAsia="Arial Unicode MS"/>
-          <w:bdr w:val="nil"/>
-          <w:lang w:val="en-GB"/>
-        </w:rPr>
-        <w:t xml:space="preserve">: a retrospective matched case-control study. International Journal of Emergency Medicine. 2024 Oct 10;17(1):153. </w:t>
+        <w:t xml:space="preserve">Kamau C, Chikophe I, Abdallah A, Mogere E. Impact of advanced trauma life support training on 30-day mortality in severely injured patients at a Kenyan tertiary center: a retrospective matched case-control study. International Journal of Emergency Medicine. 2024 Oct 10;17(1):153. </w:t>
       </w:r>
     </w:p>
     <w:p>
@@ -8503,25 +7605,7 @@
           <w:lang w:val="en-GB"/>
         </w:rPr>
         <w:tab/>
-        <w:t>Gerdin Wärnberg M, Berg J, Bhandarkar P, Chatterjee A, Chatterjee S, Chintamani C, et al. A pilot multicentre cluster randomised trial to compare the effect of trauma life support training programmes on patient and provider outcomes. BMJ Open. 2022 Apr;12(4</w:t>
-      </w:r>
-      <w:proofErr w:type="gramStart"/>
-      <w:r>
-        <w:rPr>
-          <w:rFonts w:eastAsia="Arial Unicode MS"/>
-          <w:bdr w:val="nil"/>
-          <w:lang w:val="en-GB"/>
-        </w:rPr>
-        <w:t>):e</w:t>
-      </w:r>
-      <w:proofErr w:type="gramEnd"/>
-      <w:r>
-        <w:rPr>
-          <w:rFonts w:eastAsia="Arial Unicode MS"/>
-          <w:bdr w:val="nil"/>
-          <w:lang w:val="en-GB"/>
-        </w:rPr>
-        <w:t xml:space="preserve">057504. </w:t>
+        <w:t xml:space="preserve">Gerdin Wärnberg M, Berg J, Bhandarkar P, Chatterjee A, Chatterjee S, Chintamani C, et al. A pilot multicentre cluster randomised trial to compare the effect of trauma life support training programmes on patient and provider outcomes. BMJ Open. 2022 Apr;12(4):e057504. </w:t>
       </w:r>
     </w:p>
     <w:p>
@@ -8549,43 +7633,7 @@
           <w:lang w:val="en-GB"/>
         </w:rPr>
         <w:tab/>
-        <w:t xml:space="preserve">Gerdin Wärnberg M, Basak D, Berg J, Chatterjee S, </w:t>
-      </w:r>
-      <w:proofErr w:type="spellStart"/>
-      <w:r>
-        <w:rPr>
-          <w:rFonts w:eastAsia="Arial Unicode MS"/>
-          <w:bdr w:val="nil"/>
-          <w:lang w:val="en-GB"/>
-        </w:rPr>
-        <w:t>Felländer</w:t>
-      </w:r>
-      <w:proofErr w:type="spellEnd"/>
-      <w:r>
-        <w:rPr>
-          <w:rFonts w:eastAsia="Arial Unicode MS"/>
-          <w:bdr w:val="nil"/>
-          <w:lang w:val="en-GB"/>
-        </w:rPr>
-        <w:t xml:space="preserve">-Tsai L, Ghag G, et al. Feasibility of a Cluster Randomised Trial on the Effect of Trauma Life Support Training: A Pilot Study. </w:t>
-      </w:r>
-      <w:proofErr w:type="spellStart"/>
-      <w:r>
-        <w:rPr>
-          <w:rFonts w:eastAsia="Arial Unicode MS"/>
-          <w:bdr w:val="nil"/>
-          <w:lang w:val="en-GB"/>
-        </w:rPr>
-        <w:t>medRxiv</w:t>
-      </w:r>
-      <w:proofErr w:type="spellEnd"/>
-      <w:r>
-        <w:rPr>
-          <w:rFonts w:eastAsia="Arial Unicode MS"/>
-          <w:bdr w:val="nil"/>
-          <w:lang w:val="en-GB"/>
-        </w:rPr>
-        <w:t xml:space="preserve">. 2024 Nov 26;2024.03.13.24304236. </w:t>
+        <w:t xml:space="preserve">Gerdin Wärnberg M, Basak D, Berg J, Chatterjee S, Felländer-Tsai L, Ghag G, et al. Feasibility of a Cluster Randomised Trial on the Effect of Trauma Life Support Training: A Pilot Study. medRxiv. 2024 Nov 26;2024.03.13.24304236. </w:t>
       </w:r>
     </w:p>
     <w:p>
@@ -8612,25 +7660,7 @@
           <w:lang w:val="en-GB"/>
         </w:rPr>
         <w:tab/>
-        <w:t xml:space="preserve">David S, Gerdin Wärnberg M, Trauma life support training Effectiveness Research Network (TERN) Collaborators. Patient-reported outcomes relevant to post-discharge trauma patients in urban India [Internet]. </w:t>
-      </w:r>
-      <w:proofErr w:type="spellStart"/>
-      <w:r>
-        <w:rPr>
-          <w:rFonts w:eastAsia="Arial Unicode MS"/>
-          <w:bdr w:val="nil"/>
-          <w:lang w:val="en-GB"/>
-        </w:rPr>
-        <w:t>medRxiv</w:t>
-      </w:r>
-      <w:proofErr w:type="spellEnd"/>
-      <w:r>
-        <w:rPr>
-          <w:rFonts w:eastAsia="Arial Unicode MS"/>
-          <w:bdr w:val="nil"/>
-          <w:lang w:val="en-GB"/>
-        </w:rPr>
-        <w:t>; 2024 [cited 2024 Nov 11]. p. 2024.02.20.24302971. Available from: https://www.medrxiv.org/content/10.1101/2024.02.20.24302971v2</w:t>
+        <w:t>David S, Gerdin Wärnberg M, Trauma life support training Effectiveness Research Network (TERN) Collaborators. Patient-reported outcomes relevant to post-discharge trauma patients in urban India [Internet]. medRxiv; 2024 [cited 2024 Nov 11]. p. 2024.02.20.24302971. Available from: https://www.medrxiv.org/content/10.1101/2024.02.20.24302971v2</w:t>
       </w:r>
     </w:p>
     <w:p>
@@ -8657,25 +7687,7 @@
           <w:lang w:val="en-GB"/>
         </w:rPr>
         <w:tab/>
-        <w:t xml:space="preserve">Hemming K, Haines TP, Chilton PJ, Girling AJ, </w:t>
-      </w:r>
-      <w:proofErr w:type="spellStart"/>
-      <w:r>
-        <w:rPr>
-          <w:rFonts w:eastAsia="Arial Unicode MS"/>
-          <w:bdr w:val="nil"/>
-          <w:lang w:val="en-GB"/>
-        </w:rPr>
-        <w:t>Lilford</w:t>
-      </w:r>
-      <w:proofErr w:type="spellEnd"/>
-      <w:r>
-        <w:rPr>
-          <w:rFonts w:eastAsia="Arial Unicode MS"/>
-          <w:bdr w:val="nil"/>
-          <w:lang w:val="en-GB"/>
-        </w:rPr>
-        <w:t xml:space="preserve"> RJ. The stepped wedge cluster randomised trial: rationale, design, analysis, and reporting. BMJ. 2015 Feb 6;350(feb06 1):h391–h391. </w:t>
+        <w:t xml:space="preserve">Hemming K, Haines TP, Chilton PJ, Girling AJ, Lilford RJ. The stepped wedge cluster randomised trial: rationale, design, analysis, and reporting. BMJ. 2015 Feb 6;350(feb06 1):h391–h391. </w:t>
       </w:r>
     </w:p>
     <w:p>
@@ -8810,43 +7822,7 @@
           <w:lang w:val="en-GB"/>
         </w:rPr>
         <w:tab/>
-        <w:t xml:space="preserve">Campbell MK, </w:t>
-      </w:r>
-      <w:proofErr w:type="spellStart"/>
-      <w:r>
-        <w:rPr>
-          <w:rFonts w:eastAsia="Arial Unicode MS"/>
-          <w:bdr w:val="nil"/>
-          <w:lang w:val="en-GB"/>
-        </w:rPr>
-        <w:t>Fayers</w:t>
-      </w:r>
-      <w:proofErr w:type="spellEnd"/>
-      <w:r>
-        <w:rPr>
-          <w:rFonts w:eastAsia="Arial Unicode MS"/>
-          <w:bdr w:val="nil"/>
-          <w:lang w:val="en-GB"/>
-        </w:rPr>
-        <w:t xml:space="preserve"> PM, Grimshaw JM. Determinants of the </w:t>
-      </w:r>
-      <w:proofErr w:type="spellStart"/>
-      <w:r>
-        <w:rPr>
-          <w:rFonts w:eastAsia="Arial Unicode MS"/>
-          <w:bdr w:val="nil"/>
-          <w:lang w:val="en-GB"/>
-        </w:rPr>
-        <w:t>intracluster</w:t>
-      </w:r>
-      <w:proofErr w:type="spellEnd"/>
-      <w:r>
-        <w:rPr>
-          <w:rFonts w:eastAsia="Arial Unicode MS"/>
-          <w:bdr w:val="nil"/>
-          <w:lang w:val="en-GB"/>
-        </w:rPr>
-        <w:t xml:space="preserve"> correlation coefficient in cluster randomized trials: the case of implementation research. Clinical Trials. 2005 Apr;2(2):99–107. </w:t>
+        <w:t xml:space="preserve">Campbell MK, Fayers PM, Grimshaw JM. Determinants of the intracluster correlation coefficient in cluster randomized trials: the case of implementation research. Clinical Trials. 2005 Apr;2(2):99–107. </w:t>
       </w:r>
     </w:p>
     <w:p>
@@ -8900,25 +7876,7 @@
           <w:lang w:val="en-GB"/>
         </w:rPr>
         <w:tab/>
-        <w:t xml:space="preserve">Martin J, Girling A, </w:t>
-      </w:r>
-      <w:proofErr w:type="spellStart"/>
-      <w:r>
-        <w:rPr>
-          <w:rFonts w:eastAsia="Arial Unicode MS"/>
-          <w:bdr w:val="nil"/>
-          <w:lang w:val="en-GB"/>
-        </w:rPr>
-        <w:t>Nirantharakumar</w:t>
-      </w:r>
-      <w:proofErr w:type="spellEnd"/>
-      <w:r>
-        <w:rPr>
-          <w:rFonts w:eastAsia="Arial Unicode MS"/>
-          <w:bdr w:val="nil"/>
-          <w:lang w:val="en-GB"/>
-        </w:rPr>
-        <w:t xml:space="preserve"> K, Ryan R, Marshall T, Hemming K. Intra-cluster and inter-period correlation coefficients for cross-sectional cluster randomised controlled trials for type-2 diabetes in UK primary care. Trials [Internet]. 2016 Aug;17(1). Available from: http://dx.doi.org/10.1186/s13063-016-1532-9</w:t>
+        <w:t>Martin J, Girling A, Nirantharakumar K, Ryan R, Marshall T, Hemming K. Intra-cluster and inter-period correlation coefficients for cross-sectional cluster randomised controlled trials for type-2 diabetes in UK primary care. Trials [Internet]. 2016 Aug;17(1). Available from: http://dx.doi.org/10.1186/s13063-016-1532-9</w:t>
       </w:r>
     </w:p>
     <w:p>
@@ -8945,308 +7903,77 @@
           <w:lang w:val="sv-SE"/>
         </w:rPr>
         <w:tab/>
-      </w:r>
-      <w:proofErr w:type="spellStart"/>
-      <w:r>
+        <w:t xml:space="preserve">Korevaar E, Kasza J, Taljaard M, Hemming K, Haines T, Turner EL, et al. </w:t>
+      </w:r>
+      <w:r>
+        <w:rPr>
+          <w:rFonts w:eastAsia="Arial Unicode MS"/>
+          <w:bdr w:val="nil"/>
+          <w:lang w:val="en-GB"/>
+        </w:rPr>
+        <w:t xml:space="preserve">Intra-cluster correlations from the CLustered OUtcome Dataset bank to inform the design of longitudinal cluster trials. Clinical Trials. 2021 June;18(5):529–40. </w:t>
+      </w:r>
+    </w:p>
+    <w:p>
+      <w:pPr>
+        <w:pStyle w:val="Bibliography"/>
         <w:rPr>
           <w:rFonts w:eastAsia="Arial Unicode MS"/>
           <w:bdr w:val="nil"/>
           <w:lang w:val="sv-SE"/>
         </w:rPr>
-        <w:t>Korevaar</w:t>
-      </w:r>
-      <w:proofErr w:type="spellEnd"/>
+      </w:pPr>
+      <w:r>
+        <w:rPr>
+          <w:rFonts w:eastAsia="Arial Unicode MS"/>
+          <w:bdr w:val="nil"/>
+          <w:lang w:val="en-GB"/>
+        </w:rPr>
+        <w:t>41.</w:t>
+      </w:r>
+      <w:r>
+        <w:rPr>
+          <w:rFonts w:eastAsia="Arial Unicode MS"/>
+          <w:bdr w:val="nil"/>
+          <w:lang w:val="en-GB"/>
+        </w:rPr>
+        <w:tab/>
+        <w:t xml:space="preserve">Lashoher A, Schneider EB, Juillard C, Stevens K, Colantuoni E, Berry WR, et al. Implementation of the World Health Organization Trauma Care Checklist Program in 11 Centers Across Multiple Economic Strata: Effect on Care Process Measures. </w:t>
+      </w:r>
       <w:r>
         <w:rPr>
           <w:rFonts w:eastAsia="Arial Unicode MS"/>
           <w:bdr w:val="nil"/>
           <w:lang w:val="sv-SE"/>
         </w:rPr>
-        <w:t xml:space="preserve"> E, </w:t>
-      </w:r>
-      <w:proofErr w:type="spellStart"/>
+        <w:t xml:space="preserve">World J Surg. 2017 Apr;41(4):954–62. </w:t>
+      </w:r>
+    </w:p>
+    <w:p>
+      <w:pPr>
+        <w:pStyle w:val="Bibliography"/>
+        <w:rPr>
+          <w:rFonts w:eastAsia="Arial Unicode MS"/>
+          <w:bdr w:val="nil"/>
+          <w:lang w:val="en-GB"/>
+        </w:rPr>
+      </w:pPr>
       <w:r>
         <w:rPr>
           <w:rFonts w:eastAsia="Arial Unicode MS"/>
           <w:bdr w:val="nil"/>
           <w:lang w:val="sv-SE"/>
         </w:rPr>
-        <w:t>Kasza</w:t>
-      </w:r>
-      <w:proofErr w:type="spellEnd"/>
+        <w:t>42.</w:t>
+      </w:r>
       <w:r>
         <w:rPr>
           <w:rFonts w:eastAsia="Arial Unicode MS"/>
           <w:bdr w:val="nil"/>
           <w:lang w:val="sv-SE"/>
         </w:rPr>
-        <w:t xml:space="preserve"> J, </w:t>
-      </w:r>
-      <w:proofErr w:type="spellStart"/>
-      <w:r>
-        <w:rPr>
-          <w:rFonts w:eastAsia="Arial Unicode MS"/>
-          <w:bdr w:val="nil"/>
-          <w:lang w:val="sv-SE"/>
-        </w:rPr>
-        <w:t>Taljaard</w:t>
-      </w:r>
-      <w:proofErr w:type="spellEnd"/>
-      <w:r>
-        <w:rPr>
-          <w:rFonts w:eastAsia="Arial Unicode MS"/>
-          <w:bdr w:val="nil"/>
-          <w:lang w:val="sv-SE"/>
-        </w:rPr>
-        <w:t xml:space="preserve"> M, Hemming K, Haines T, Turner EL, et al. </w:t>
-      </w:r>
-      <w:r>
-        <w:rPr>
-          <w:rFonts w:eastAsia="Arial Unicode MS"/>
-          <w:bdr w:val="nil"/>
-          <w:lang w:val="en-GB"/>
-        </w:rPr>
-        <w:t xml:space="preserve">Intra-cluster correlations from the </w:t>
-      </w:r>
-      <w:proofErr w:type="spellStart"/>
-      <w:r>
-        <w:rPr>
-          <w:rFonts w:eastAsia="Arial Unicode MS"/>
-          <w:bdr w:val="nil"/>
-          <w:lang w:val="en-GB"/>
-        </w:rPr>
-        <w:t>CLustered</w:t>
-      </w:r>
-      <w:proofErr w:type="spellEnd"/>
-      <w:r>
-        <w:rPr>
-          <w:rFonts w:eastAsia="Arial Unicode MS"/>
-          <w:bdr w:val="nil"/>
-          <w:lang w:val="en-GB"/>
-        </w:rPr>
-        <w:t xml:space="preserve"> </w:t>
-      </w:r>
-      <w:proofErr w:type="spellStart"/>
-      <w:r>
-        <w:rPr>
-          <w:rFonts w:eastAsia="Arial Unicode MS"/>
-          <w:bdr w:val="nil"/>
-          <w:lang w:val="en-GB"/>
-        </w:rPr>
-        <w:t>OUtcome</w:t>
-      </w:r>
-      <w:proofErr w:type="spellEnd"/>
-      <w:r>
-        <w:rPr>
-          <w:rFonts w:eastAsia="Arial Unicode MS"/>
-          <w:bdr w:val="nil"/>
-          <w:lang w:val="en-GB"/>
-        </w:rPr>
-        <w:t xml:space="preserve"> Dataset bank to inform the design of longitudinal cluster trials. Clinical Trials. 2021 June;18(5):529–40. </w:t>
-      </w:r>
-    </w:p>
-    <w:p>
-      <w:pPr>
-        <w:pStyle w:val="Bibliography"/>
-        <w:rPr>
-          <w:rFonts w:eastAsia="Arial Unicode MS"/>
-          <w:bdr w:val="nil"/>
-          <w:lang w:val="sv-SE"/>
-        </w:rPr>
-      </w:pPr>
-      <w:r>
-        <w:rPr>
-          <w:rFonts w:eastAsia="Arial Unicode MS"/>
-          <w:bdr w:val="nil"/>
-          <w:lang w:val="en-GB"/>
-        </w:rPr>
-        <w:t>41.</w:t>
-      </w:r>
-      <w:r>
-        <w:rPr>
-          <w:rFonts w:eastAsia="Arial Unicode MS"/>
-          <w:bdr w:val="nil"/>
-          <w:lang w:val="en-GB"/>
-        </w:rPr>
         <w:tab/>
-      </w:r>
-      <w:proofErr w:type="spellStart"/>
-      <w:r>
-        <w:rPr>
-          <w:rFonts w:eastAsia="Arial Unicode MS"/>
-          <w:bdr w:val="nil"/>
-          <w:lang w:val="en-GB"/>
-        </w:rPr>
-        <w:t>Lashoher</w:t>
-      </w:r>
-      <w:proofErr w:type="spellEnd"/>
-      <w:r>
-        <w:rPr>
-          <w:rFonts w:eastAsia="Arial Unicode MS"/>
-          <w:bdr w:val="nil"/>
-          <w:lang w:val="en-GB"/>
-        </w:rPr>
-        <w:t xml:space="preserve"> A, Schneider EB, </w:t>
-      </w:r>
-      <w:proofErr w:type="spellStart"/>
-      <w:r>
-        <w:rPr>
-          <w:rFonts w:eastAsia="Arial Unicode MS"/>
-          <w:bdr w:val="nil"/>
-          <w:lang w:val="en-GB"/>
-        </w:rPr>
-        <w:t>Juillard</w:t>
-      </w:r>
-      <w:proofErr w:type="spellEnd"/>
-      <w:r>
-        <w:rPr>
-          <w:rFonts w:eastAsia="Arial Unicode MS"/>
-          <w:bdr w:val="nil"/>
-          <w:lang w:val="en-GB"/>
-        </w:rPr>
-        <w:t xml:space="preserve"> C, Stevens K, Colantuoni E, Berry WR, et al. Implementation of the World Health Organization Trauma Care Checklist Program in 11 </w:t>
-      </w:r>
-      <w:proofErr w:type="spellStart"/>
-      <w:r>
-        <w:rPr>
-          <w:rFonts w:eastAsia="Arial Unicode MS"/>
-          <w:bdr w:val="nil"/>
-          <w:lang w:val="en-GB"/>
-        </w:rPr>
-        <w:t>Centers</w:t>
-      </w:r>
-      <w:proofErr w:type="spellEnd"/>
-      <w:r>
-        <w:rPr>
-          <w:rFonts w:eastAsia="Arial Unicode MS"/>
-          <w:bdr w:val="nil"/>
-          <w:lang w:val="en-GB"/>
-        </w:rPr>
-        <w:t xml:space="preserve"> Across Multiple Economic Strata: Effect on Care Process Measures. </w:t>
-      </w:r>
-      <w:r>
-        <w:rPr>
-          <w:rFonts w:eastAsia="Arial Unicode MS"/>
-          <w:bdr w:val="nil"/>
-          <w:lang w:val="sv-SE"/>
-        </w:rPr>
-        <w:t xml:space="preserve">World J </w:t>
-      </w:r>
-      <w:proofErr w:type="spellStart"/>
-      <w:r>
-        <w:rPr>
-          <w:rFonts w:eastAsia="Arial Unicode MS"/>
-          <w:bdr w:val="nil"/>
-          <w:lang w:val="sv-SE"/>
-        </w:rPr>
-        <w:t>Surg</w:t>
-      </w:r>
-      <w:proofErr w:type="spellEnd"/>
-      <w:r>
-        <w:rPr>
-          <w:rFonts w:eastAsia="Arial Unicode MS"/>
-          <w:bdr w:val="nil"/>
-          <w:lang w:val="sv-SE"/>
-        </w:rPr>
-        <w:t xml:space="preserve">. 2017 </w:t>
-      </w:r>
-      <w:proofErr w:type="gramStart"/>
-      <w:r>
-        <w:rPr>
-          <w:rFonts w:eastAsia="Arial Unicode MS"/>
-          <w:bdr w:val="nil"/>
-          <w:lang w:val="sv-SE"/>
-        </w:rPr>
-        <w:t>Apr</w:t>
-      </w:r>
-      <w:proofErr w:type="gramEnd"/>
-      <w:r>
-        <w:rPr>
-          <w:rFonts w:eastAsia="Arial Unicode MS"/>
-          <w:bdr w:val="nil"/>
-          <w:lang w:val="sv-SE"/>
-        </w:rPr>
-        <w:t xml:space="preserve">;41(4):954–62. </w:t>
-      </w:r>
-    </w:p>
-    <w:p>
-      <w:pPr>
-        <w:pStyle w:val="Bibliography"/>
-        <w:rPr>
-          <w:rFonts w:eastAsia="Arial Unicode MS"/>
-          <w:bdr w:val="nil"/>
-          <w:lang w:val="en-GB"/>
-        </w:rPr>
-      </w:pPr>
-      <w:r>
-        <w:rPr>
-          <w:rFonts w:eastAsia="Arial Unicode MS"/>
-          <w:bdr w:val="nil"/>
-          <w:lang w:val="sv-SE"/>
-        </w:rPr>
-        <w:t>42.</w:t>
-      </w:r>
-      <w:r>
-        <w:rPr>
-          <w:rFonts w:eastAsia="Arial Unicode MS"/>
-          <w:bdr w:val="nil"/>
-          <w:lang w:val="sv-SE"/>
-        </w:rPr>
-        <w:tab/>
-      </w:r>
-      <w:proofErr w:type="spellStart"/>
-      <w:r>
-        <w:rPr>
-          <w:rFonts w:eastAsia="Arial Unicode MS"/>
-          <w:bdr w:val="nil"/>
-          <w:lang w:val="sv-SE"/>
-        </w:rPr>
-        <w:t>Kapitan</w:t>
-      </w:r>
-      <w:proofErr w:type="spellEnd"/>
-      <w:r>
-        <w:rPr>
-          <w:rFonts w:eastAsia="Arial Unicode MS"/>
-          <w:bdr w:val="nil"/>
-          <w:lang w:val="sv-SE"/>
-        </w:rPr>
-        <w:t xml:space="preserve"> E, Berg J, David S, N ML, </w:t>
-      </w:r>
-      <w:proofErr w:type="spellStart"/>
-      <w:r>
-        <w:rPr>
-          <w:rFonts w:eastAsia="Arial Unicode MS"/>
-          <w:bdr w:val="nil"/>
-          <w:lang w:val="sv-SE"/>
-        </w:rPr>
-        <w:t>Felländer-Tsai</w:t>
-      </w:r>
-      <w:proofErr w:type="spellEnd"/>
-      <w:r>
-        <w:rPr>
-          <w:rFonts w:eastAsia="Arial Unicode MS"/>
-          <w:bdr w:val="nil"/>
-          <w:lang w:val="sv-SE"/>
-        </w:rPr>
-        <w:t xml:space="preserve"> L, </w:t>
-      </w:r>
-      <w:proofErr w:type="spellStart"/>
-      <w:r>
-        <w:rPr>
-          <w:rFonts w:eastAsia="Arial Unicode MS"/>
-          <w:bdr w:val="nil"/>
-          <w:lang w:val="sv-SE"/>
-        </w:rPr>
-        <w:t>Chatterjee</w:t>
-      </w:r>
-      <w:proofErr w:type="spellEnd"/>
-      <w:r>
-        <w:rPr>
-          <w:rFonts w:eastAsia="Arial Unicode MS"/>
-          <w:bdr w:val="nil"/>
-          <w:lang w:val="sv-SE"/>
-        </w:rPr>
-        <w:t xml:space="preserve"> S, et al. </w:t>
+        <w:t xml:space="preserve">Kapitan E, Berg J, David S, N ML, Felländer-Tsai L, Chatterjee S, et al. </w:t>
       </w:r>
       <w:r>
         <w:rPr>
@@ -9309,25 +8036,7 @@
           <w:lang w:val="en-GB"/>
         </w:rPr>
         <w:tab/>
-        <w:t>Harris PA, Taylor R, Thielke R, Payne J, Gonzalez N, Conde JG. Research electronic data capture (</w:t>
-      </w:r>
-      <w:proofErr w:type="spellStart"/>
-      <w:r>
-        <w:rPr>
-          <w:rFonts w:eastAsia="Arial Unicode MS"/>
-          <w:bdr w:val="nil"/>
-          <w:lang w:val="en-GB"/>
-        </w:rPr>
-        <w:t>REDCap</w:t>
-      </w:r>
-      <w:proofErr w:type="spellEnd"/>
-      <w:r>
-        <w:rPr>
-          <w:rFonts w:eastAsia="Arial Unicode MS"/>
-          <w:bdr w:val="nil"/>
-          <w:lang w:val="en-GB"/>
-        </w:rPr>
-        <w:t xml:space="preserve">)--a metadata-driven methodology and workflow process for providing translational research informatics support. </w:t>
+        <w:t xml:space="preserve">Harris PA, Taylor R, Thielke R, Payne J, Gonzalez N, Conde JG. Research electronic data capture (REDCap)--a metadata-driven methodology and workflow process for providing translational research informatics support. </w:t>
       </w:r>
       <w:r>
         <w:rPr>
@@ -9335,61 +8044,7 @@
           <w:bdr w:val="nil"/>
           <w:lang w:val="sv-SE"/>
         </w:rPr>
-        <w:t xml:space="preserve">J </w:t>
-      </w:r>
-      <w:proofErr w:type="spellStart"/>
-      <w:r>
-        <w:rPr>
-          <w:rFonts w:eastAsia="Arial Unicode MS"/>
-          <w:bdr w:val="nil"/>
-          <w:lang w:val="sv-SE"/>
-        </w:rPr>
-        <w:t>Biomed</w:t>
-      </w:r>
-      <w:proofErr w:type="spellEnd"/>
-      <w:r>
-        <w:rPr>
-          <w:rFonts w:eastAsia="Arial Unicode MS"/>
-          <w:bdr w:val="nil"/>
-          <w:lang w:val="sv-SE"/>
-        </w:rPr>
-        <w:t xml:space="preserve"> </w:t>
-      </w:r>
-      <w:proofErr w:type="spellStart"/>
-      <w:r>
-        <w:rPr>
-          <w:rFonts w:eastAsia="Arial Unicode MS"/>
-          <w:bdr w:val="nil"/>
-          <w:lang w:val="sv-SE"/>
-        </w:rPr>
-        <w:t>Inform</w:t>
-      </w:r>
-      <w:proofErr w:type="spellEnd"/>
-      <w:r>
-        <w:rPr>
-          <w:rFonts w:eastAsia="Arial Unicode MS"/>
-          <w:bdr w:val="nil"/>
-          <w:lang w:val="sv-SE"/>
-        </w:rPr>
-        <w:t xml:space="preserve">. 2009 </w:t>
-      </w:r>
-      <w:proofErr w:type="gramStart"/>
-      <w:r>
-        <w:rPr>
-          <w:rFonts w:eastAsia="Arial Unicode MS"/>
-          <w:bdr w:val="nil"/>
-          <w:lang w:val="sv-SE"/>
-        </w:rPr>
-        <w:t>Apr</w:t>
-      </w:r>
-      <w:proofErr w:type="gramEnd"/>
-      <w:r>
-        <w:rPr>
-          <w:rFonts w:eastAsia="Arial Unicode MS"/>
-          <w:bdr w:val="nil"/>
-          <w:lang w:val="sv-SE"/>
-        </w:rPr>
-        <w:t xml:space="preserve">;42(2):377–81. </w:t>
+        <w:t xml:space="preserve">J Biomed Inform. 2009 Apr;42(2):377–81. </w:t>
       </w:r>
     </w:p>
     <w:p>
@@ -9424,43 +8079,7 @@
           <w:bdr w:val="nil"/>
           <w:lang w:val="en-GB"/>
         </w:rPr>
-        <w:t xml:space="preserve">The </w:t>
-      </w:r>
-      <w:proofErr w:type="spellStart"/>
-      <w:r>
-        <w:rPr>
-          <w:rFonts w:eastAsia="Arial Unicode MS"/>
-          <w:bdr w:val="nil"/>
-          <w:lang w:val="en-GB"/>
-        </w:rPr>
-        <w:t>REDCap</w:t>
-      </w:r>
-      <w:proofErr w:type="spellEnd"/>
-      <w:r>
-        <w:rPr>
-          <w:rFonts w:eastAsia="Arial Unicode MS"/>
-          <w:bdr w:val="nil"/>
-          <w:lang w:val="en-GB"/>
-        </w:rPr>
-        <w:t xml:space="preserve"> consortium: Building an international community of software platform partners. J Biomed Inform. 2019 </w:t>
-      </w:r>
-      <w:proofErr w:type="gramStart"/>
-      <w:r>
-        <w:rPr>
-          <w:rFonts w:eastAsia="Arial Unicode MS"/>
-          <w:bdr w:val="nil"/>
-          <w:lang w:val="en-GB"/>
-        </w:rPr>
-        <w:t>July;95:103208</w:t>
-      </w:r>
-      <w:proofErr w:type="gramEnd"/>
-      <w:r>
-        <w:rPr>
-          <w:rFonts w:eastAsia="Arial Unicode MS"/>
-          <w:bdr w:val="nil"/>
-          <w:lang w:val="en-GB"/>
-        </w:rPr>
-        <w:t xml:space="preserve">. </w:t>
+        <w:t xml:space="preserve">The REDCap consortium: Building an international community of software platform partners. J Biomed Inform. 2019 July;95:103208. </w:t>
       </w:r>
     </w:p>
     <w:p>
@@ -9514,24 +8133,7 @@
           <w:lang w:val="en-GB"/>
         </w:rPr>
         <w:tab/>
-      </w:r>
-      <w:proofErr w:type="spellStart"/>
-      <w:r>
-        <w:rPr>
-          <w:rFonts w:eastAsia="Arial Unicode MS"/>
-          <w:bdr w:val="nil"/>
-          <w:lang w:val="en-GB"/>
-        </w:rPr>
-        <w:t>Voldal</w:t>
-      </w:r>
-      <w:proofErr w:type="spellEnd"/>
-      <w:r>
-        <w:rPr>
-          <w:rFonts w:eastAsia="Arial Unicode MS"/>
-          <w:bdr w:val="nil"/>
-          <w:lang w:val="en-GB"/>
-        </w:rPr>
-        <w:t xml:space="preserve"> EC, Xia F, Kenny A, Heagerty PJ, Hughes JP. Model misspecification in stepped wedge trials: Random effects for time or treatment. Stat Med. 2022 May 10;41(10):1751–66. </w:t>
+        <w:t xml:space="preserve">Voldal EC, Xia F, Kenny A, Heagerty PJ, Hughes JP. Model misspecification in stepped wedge trials: Random effects for time or treatment. Stat Med. 2022 May 10;41(10):1751–66. </w:t>
       </w:r>
     </w:p>
     <w:p>
@@ -9558,25 +8160,7 @@
           <w:lang w:val="en-GB"/>
         </w:rPr>
         <w:tab/>
-        <w:t xml:space="preserve">Grantham KL, Kasza J, Heritier S, Carlin JB, Forbes AB. Evaluating the performance of Bayesian and restricted maximum likelihood estimation for stepped wedge cluster randomized trials with a small number of clusters. BMC Med Res </w:t>
-      </w:r>
-      <w:proofErr w:type="spellStart"/>
-      <w:r>
-        <w:rPr>
-          <w:rFonts w:eastAsia="Arial Unicode MS"/>
-          <w:bdr w:val="nil"/>
-          <w:lang w:val="en-GB"/>
-        </w:rPr>
-        <w:t>Methodol</w:t>
-      </w:r>
-      <w:proofErr w:type="spellEnd"/>
-      <w:r>
-        <w:rPr>
-          <w:rFonts w:eastAsia="Arial Unicode MS"/>
-          <w:bdr w:val="nil"/>
-          <w:lang w:val="en-GB"/>
-        </w:rPr>
-        <w:t xml:space="preserve">. 2022 Apr 13;22(1):112. </w:t>
+        <w:t xml:space="preserve">Grantham KL, Kasza J, Heritier S, Carlin JB, Forbes AB. Evaluating the performance of Bayesian and restricted maximum likelihood estimation for stepped wedge cluster randomized trials with a small number of clusters. BMC Med Res Methodol. 2022 Apr 13;22(1):112. </w:t>
       </w:r>
     </w:p>
     <w:p>
@@ -9603,43 +8187,7 @@
           <w:lang w:val="en-GB"/>
         </w:rPr>
         <w:tab/>
-        <w:t xml:space="preserve">Diaz T, Strong KL, Cao B, </w:t>
-      </w:r>
-      <w:proofErr w:type="spellStart"/>
-      <w:r>
-        <w:rPr>
-          <w:rFonts w:eastAsia="Arial Unicode MS"/>
-          <w:bdr w:val="nil"/>
-          <w:lang w:val="en-GB"/>
-        </w:rPr>
-        <w:t>Guthold</w:t>
-      </w:r>
-      <w:proofErr w:type="spellEnd"/>
-      <w:r>
-        <w:rPr>
-          <w:rFonts w:eastAsia="Arial Unicode MS"/>
-          <w:bdr w:val="nil"/>
-          <w:lang w:val="en-GB"/>
-        </w:rPr>
-        <w:t xml:space="preserve"> R, Moran AC, Moller AB, et al. A call for standardised age-disaggregated health data. The Lancet Healthy Longevity. 2021 July 1;2(7</w:t>
-      </w:r>
-      <w:proofErr w:type="gramStart"/>
-      <w:r>
-        <w:rPr>
-          <w:rFonts w:eastAsia="Arial Unicode MS"/>
-          <w:bdr w:val="nil"/>
-          <w:lang w:val="en-GB"/>
-        </w:rPr>
-        <w:t>):e</w:t>
-      </w:r>
-      <w:proofErr w:type="gramEnd"/>
-      <w:r>
-        <w:rPr>
-          <w:rFonts w:eastAsia="Arial Unicode MS"/>
-          <w:bdr w:val="nil"/>
-          <w:lang w:val="en-GB"/>
-        </w:rPr>
-        <w:t xml:space="preserve">436–43. </w:t>
+        <w:t xml:space="preserve">Diaz T, Strong KL, Cao B, Guthold R, Moran AC, Moller AB, et al. A call for standardised age-disaggregated health data. The Lancet Healthy Longevity. 2021 July 1;2(7):e436–43. </w:t>
       </w:r>
     </w:p>
     <w:p>
@@ -9666,25 +8214,7 @@
           <w:lang w:val="en-GB"/>
         </w:rPr>
         <w:tab/>
-        <w:t xml:space="preserve">Hornor MA, Hoeft C, </w:t>
-      </w:r>
-      <w:proofErr w:type="spellStart"/>
-      <w:r>
-        <w:rPr>
-          <w:rFonts w:eastAsia="Arial Unicode MS"/>
-          <w:bdr w:val="nil"/>
-          <w:lang w:val="en-GB"/>
-        </w:rPr>
-        <w:t>Nathens</w:t>
-      </w:r>
-      <w:proofErr w:type="spellEnd"/>
-      <w:r>
-        <w:rPr>
-          <w:rFonts w:eastAsia="Arial Unicode MS"/>
-          <w:bdr w:val="nil"/>
-          <w:lang w:val="en-GB"/>
-        </w:rPr>
-        <w:t xml:space="preserve"> AB. Quality Benchmarking in Trauma: from the NTDB to TQIP. Current Trauma Reports. 2018 Apr;4(2):160–9. </w:t>
+        <w:t xml:space="preserve">Hornor MA, Hoeft C, Nathens AB. Quality Benchmarking in Trauma: from the NTDB to TQIP. Current Trauma Reports. 2018 Apr;4(2):160–9. </w:t>
       </w:r>
     </w:p>
     <w:p>
@@ -9711,43 +8241,7 @@
           <w:lang w:val="en-GB"/>
         </w:rPr>
         <w:tab/>
-        <w:t xml:space="preserve">Kamp CB, Dankiewicz J, Harboe Olsen M, Holgersson J, Saxena M, Young P, et al. Sedation, temperature and pressure after cardiac arrest and resuscitation—The STEPCARE trial: A statistical analysis plan. Acta </w:t>
-      </w:r>
-      <w:proofErr w:type="spellStart"/>
-      <w:r>
-        <w:rPr>
-          <w:rFonts w:eastAsia="Arial Unicode MS"/>
-          <w:bdr w:val="nil"/>
-          <w:lang w:val="en-GB"/>
-        </w:rPr>
-        <w:t>Anaesthesiologica</w:t>
-      </w:r>
-      <w:proofErr w:type="spellEnd"/>
-      <w:r>
-        <w:rPr>
-          <w:rFonts w:eastAsia="Arial Unicode MS"/>
-          <w:bdr w:val="nil"/>
-          <w:lang w:val="en-GB"/>
-        </w:rPr>
-        <w:t xml:space="preserve"> Scandinavica. 2025;69(5</w:t>
-      </w:r>
-      <w:proofErr w:type="gramStart"/>
-      <w:r>
-        <w:rPr>
-          <w:rFonts w:eastAsia="Arial Unicode MS"/>
-          <w:bdr w:val="nil"/>
-          <w:lang w:val="en-GB"/>
-        </w:rPr>
-        <w:t>):e</w:t>
-      </w:r>
-      <w:proofErr w:type="gramEnd"/>
-      <w:r>
-        <w:rPr>
-          <w:rFonts w:eastAsia="Arial Unicode MS"/>
-          <w:bdr w:val="nil"/>
-          <w:lang w:val="en-GB"/>
-        </w:rPr>
-        <w:t xml:space="preserve">70033. </w:t>
+        <w:t xml:space="preserve">Kamp CB, Dankiewicz J, Harboe Olsen M, Holgersson J, Saxena M, Young P, et al. Sedation, temperature and pressure after cardiac arrest and resuscitation—The STEPCARE trial: A statistical analysis plan. Acta Anaesthesiologica Scandinavica. 2025;69(5):e70033. </w:t>
       </w:r>
     </w:p>
     <w:p>
@@ -12593,6 +11087,7 @@
   <w:style w:type="character" w:default="1" w:styleId="DefaultParagraphFont">
     <w:name w:val="Default Paragraph Font"/>
     <w:uiPriority w:val="1"/>
+    <w:semiHidden/>
     <w:unhideWhenUsed/>
   </w:style>
   <w:style w:type="table" w:default="1" w:styleId="TableNormal">

</xml_diff>